<commit_message>
doc(rapport, Diagramme UML): Amélioration du rapport, refonte et division du diagramme UML pour plus de lisibilité
</commit_message>
<xml_diff>
--- a/Doc/H-P_POO-gillhorset-RapportDeProjet.docx
+++ b/Doc/H-P_POO-gillhorset-RapportDeProjet.docx
@@ -188,7 +188,7 @@
         </w:rPr>
         <w:fldChar w:fldCharType="separate"/>
       </w:r>
-      <w:hyperlink w:anchor="_Toc212934602" w:history="1">
+      <w:hyperlink w:anchor="_Toc213352291" w:history="1">
         <w:r>
           <w:rPr>
             <w:rStyle w:val="Lienhypertexte"/>
@@ -236,7 +236,7 @@
             <w:noProof/>
             <w:webHidden/>
           </w:rPr>
-          <w:instrText xml:space="preserve"> PAGEREF _Toc212934602 \h </w:instrText>
+          <w:instrText xml:space="preserve"> PAGEREF _Toc213352291 \h </w:instrText>
         </w:r>
         <w:r>
           <w:rPr>
@@ -284,7 +284,7 @@
           <w14:ligatures w14:val="standardContextual"/>
         </w:rPr>
       </w:pPr>
-      <w:hyperlink w:anchor="_Toc212934603" w:history="1">
+      <w:hyperlink w:anchor="_Toc213352292" w:history="1">
         <w:r>
           <w:rPr>
             <w:rStyle w:val="Lienhypertexte"/>
@@ -330,7 +330,7 @@
             <w:noProof/>
             <w:webHidden/>
           </w:rPr>
-          <w:instrText xml:space="preserve"> PAGEREF _Toc212934603 \h </w:instrText>
+          <w:instrText xml:space="preserve"> PAGEREF _Toc213352292 \h </w:instrText>
         </w:r>
         <w:r>
           <w:rPr>
@@ -378,7 +378,7 @@
           <w14:ligatures w14:val="standardContextual"/>
         </w:rPr>
       </w:pPr>
-      <w:hyperlink w:anchor="_Toc212934604" w:history="1">
+      <w:hyperlink w:anchor="_Toc213352293" w:history="1">
         <w:r>
           <w:rPr>
             <w:rStyle w:val="Lienhypertexte"/>
@@ -424,7 +424,7 @@
             <w:noProof/>
             <w:webHidden/>
           </w:rPr>
-          <w:instrText xml:space="preserve"> PAGEREF _Toc212934604 \h </w:instrText>
+          <w:instrText xml:space="preserve"> PAGEREF _Toc213352293 \h </w:instrText>
         </w:r>
         <w:r>
           <w:rPr>
@@ -472,7 +472,7 @@
           <w14:ligatures w14:val="standardContextual"/>
         </w:rPr>
       </w:pPr>
-      <w:hyperlink w:anchor="_Toc212934605" w:history="1">
+      <w:hyperlink w:anchor="_Toc213352294" w:history="1">
         <w:r>
           <w:rPr>
             <w:rStyle w:val="Lienhypertexte"/>
@@ -518,7 +518,7 @@
             <w:noProof/>
             <w:webHidden/>
           </w:rPr>
-          <w:instrText xml:space="preserve"> PAGEREF _Toc212934605 \h </w:instrText>
+          <w:instrText xml:space="preserve"> PAGEREF _Toc213352294 \h </w:instrText>
         </w:r>
         <w:r>
           <w:rPr>
@@ -567,7 +567,7 @@
           <w14:ligatures w14:val="standardContextual"/>
         </w:rPr>
       </w:pPr>
-      <w:hyperlink w:anchor="_Toc212934606" w:history="1">
+      <w:hyperlink w:anchor="_Toc213352295" w:history="1">
         <w:r>
           <w:rPr>
             <w:rStyle w:val="Lienhypertexte"/>
@@ -614,7 +614,7 @@
             <w:noProof/>
             <w:webHidden/>
           </w:rPr>
-          <w:instrText xml:space="preserve"> PAGEREF _Toc212934606 \h </w:instrText>
+          <w:instrText xml:space="preserve"> PAGEREF _Toc213352295 \h </w:instrText>
         </w:r>
         <w:r>
           <w:rPr>
@@ -663,7 +663,7 @@
           <w14:ligatures w14:val="standardContextual"/>
         </w:rPr>
       </w:pPr>
-      <w:hyperlink w:anchor="_Toc212934607" w:history="1">
+      <w:hyperlink w:anchor="_Toc213352296" w:history="1">
         <w:r>
           <w:rPr>
             <w:rStyle w:val="Lienhypertexte"/>
@@ -710,7 +710,7 @@
             <w:noProof/>
             <w:webHidden/>
           </w:rPr>
-          <w:instrText xml:space="preserve"> PAGEREF _Toc212934607 \h </w:instrText>
+          <w:instrText xml:space="preserve"> PAGEREF _Toc213352296 \h </w:instrText>
         </w:r>
         <w:r>
           <w:rPr>
@@ -760,7 +760,7 @@
           <w14:ligatures w14:val="standardContextual"/>
         </w:rPr>
       </w:pPr>
-      <w:hyperlink w:anchor="_Toc212934608" w:history="1">
+      <w:hyperlink w:anchor="_Toc213352297" w:history="1">
         <w:r>
           <w:rPr>
             <w:rStyle w:val="Lienhypertexte"/>
@@ -808,7 +808,7 @@
             <w:noProof/>
             <w:webHidden/>
           </w:rPr>
-          <w:instrText xml:space="preserve"> PAGEREF _Toc212934608 \h </w:instrText>
+          <w:instrText xml:space="preserve"> PAGEREF _Toc213352297 \h </w:instrText>
         </w:r>
         <w:r>
           <w:rPr>
@@ -856,7 +856,7 @@
           <w14:ligatures w14:val="standardContextual"/>
         </w:rPr>
       </w:pPr>
-      <w:hyperlink w:anchor="_Toc212934609" w:history="1">
+      <w:hyperlink w:anchor="_Toc213352298" w:history="1">
         <w:r>
           <w:rPr>
             <w:rStyle w:val="Lienhypertexte"/>
@@ -902,7 +902,7 @@
             <w:noProof/>
             <w:webHidden/>
           </w:rPr>
-          <w:instrText xml:space="preserve"> PAGEREF _Toc212934609 \h </w:instrText>
+          <w:instrText xml:space="preserve"> PAGEREF _Toc213352298 \h </w:instrText>
         </w:r>
         <w:r>
           <w:rPr>
@@ -950,7 +950,7 @@
           <w14:ligatures w14:val="standardContextual"/>
         </w:rPr>
       </w:pPr>
-      <w:hyperlink w:anchor="_Toc212934610" w:history="1">
+      <w:hyperlink w:anchor="_Toc213352299" w:history="1">
         <w:r>
           <w:rPr>
             <w:rStyle w:val="Lienhypertexte"/>
@@ -996,7 +996,7 @@
             <w:noProof/>
             <w:webHidden/>
           </w:rPr>
-          <w:instrText xml:space="preserve"> PAGEREF _Toc212934610 \h </w:instrText>
+          <w:instrText xml:space="preserve"> PAGEREF _Toc213352299 \h </w:instrText>
         </w:r>
         <w:r>
           <w:rPr>
@@ -1044,7 +1044,7 @@
           <w14:ligatures w14:val="standardContextual"/>
         </w:rPr>
       </w:pPr>
-      <w:hyperlink w:anchor="_Toc212934611" w:history="1">
+      <w:hyperlink w:anchor="_Toc213352300" w:history="1">
         <w:r>
           <w:rPr>
             <w:rStyle w:val="Lienhypertexte"/>
@@ -1090,7 +1090,7 @@
             <w:noProof/>
             <w:webHidden/>
           </w:rPr>
-          <w:instrText xml:space="preserve"> PAGEREF _Toc212934611 \h </w:instrText>
+          <w:instrText xml:space="preserve"> PAGEREF _Toc213352300 \h </w:instrText>
         </w:r>
         <w:r>
           <w:rPr>
@@ -1139,7 +1139,7 @@
           <w14:ligatures w14:val="standardContextual"/>
         </w:rPr>
       </w:pPr>
-      <w:hyperlink w:anchor="_Toc212934612" w:history="1">
+      <w:hyperlink w:anchor="_Toc213352301" w:history="1">
         <w:r>
           <w:rPr>
             <w:rStyle w:val="Lienhypertexte"/>
@@ -1186,7 +1186,7 @@
             <w:noProof/>
             <w:webHidden/>
           </w:rPr>
-          <w:instrText xml:space="preserve"> PAGEREF _Toc212934612 \h </w:instrText>
+          <w:instrText xml:space="preserve"> PAGEREF _Toc213352301 \h </w:instrText>
         </w:r>
         <w:r>
           <w:rPr>
@@ -1235,7 +1235,7 @@
           <w14:ligatures w14:val="standardContextual"/>
         </w:rPr>
       </w:pPr>
-      <w:hyperlink w:anchor="_Toc212934613" w:history="1">
+      <w:hyperlink w:anchor="_Toc213352302" w:history="1">
         <w:r>
           <w:rPr>
             <w:rStyle w:val="Lienhypertexte"/>
@@ -1282,7 +1282,7 @@
             <w:noProof/>
             <w:webHidden/>
           </w:rPr>
-          <w:instrText xml:space="preserve"> PAGEREF _Toc212934613 \h </w:instrText>
+          <w:instrText xml:space="preserve"> PAGEREF _Toc213352302 \h </w:instrText>
         </w:r>
         <w:r>
           <w:rPr>
@@ -1331,7 +1331,7 @@
           <w14:ligatures w14:val="standardContextual"/>
         </w:rPr>
       </w:pPr>
-      <w:hyperlink w:anchor="_Toc212934614" w:history="1">
+      <w:hyperlink w:anchor="_Toc213352303" w:history="1">
         <w:r>
           <w:rPr>
             <w:rStyle w:val="Lienhypertexte"/>
@@ -1378,7 +1378,7 @@
             <w:noProof/>
             <w:webHidden/>
           </w:rPr>
-          <w:instrText xml:space="preserve"> PAGEREF _Toc212934614 \h </w:instrText>
+          <w:instrText xml:space="preserve"> PAGEREF _Toc213352303 \h </w:instrText>
         </w:r>
         <w:r>
           <w:rPr>
@@ -1398,7 +1398,7 @@
             <w:noProof/>
             <w:webHidden/>
           </w:rPr>
-          <w:t>5</w:t>
+          <w:t>4</w:t>
         </w:r>
         <w:r>
           <w:rPr>
@@ -1427,7 +1427,7 @@
           <w14:ligatures w14:val="standardContextual"/>
         </w:rPr>
       </w:pPr>
-      <w:hyperlink w:anchor="_Toc212934615" w:history="1">
+      <w:hyperlink w:anchor="_Toc213352304" w:history="1">
         <w:r>
           <w:rPr>
             <w:rStyle w:val="Lienhypertexte"/>
@@ -1474,7 +1474,7 @@
             <w:noProof/>
             <w:webHidden/>
           </w:rPr>
-          <w:instrText xml:space="preserve"> PAGEREF _Toc212934615 \h </w:instrText>
+          <w:instrText xml:space="preserve"> PAGEREF _Toc213352304 \h </w:instrText>
         </w:r>
         <w:r>
           <w:rPr>
@@ -1523,7 +1523,7 @@
           <w14:ligatures w14:val="standardContextual"/>
         </w:rPr>
       </w:pPr>
-      <w:hyperlink w:anchor="_Toc212934616" w:history="1">
+      <w:hyperlink w:anchor="_Toc213352305" w:history="1">
         <w:r>
           <w:rPr>
             <w:rStyle w:val="Lienhypertexte"/>
@@ -1570,7 +1570,7 @@
             <w:noProof/>
             <w:webHidden/>
           </w:rPr>
-          <w:instrText xml:space="preserve"> PAGEREF _Toc212934616 \h </w:instrText>
+          <w:instrText xml:space="preserve"> PAGEREF _Toc213352305 \h </w:instrText>
         </w:r>
         <w:r>
           <w:rPr>
@@ -1619,7 +1619,7 @@
           <w14:ligatures w14:val="standardContextual"/>
         </w:rPr>
       </w:pPr>
-      <w:hyperlink w:anchor="_Toc212934617" w:history="1">
+      <w:hyperlink w:anchor="_Toc213352306" w:history="1">
         <w:r>
           <w:rPr>
             <w:rStyle w:val="Lienhypertexte"/>
@@ -1666,7 +1666,7 @@
             <w:noProof/>
             <w:webHidden/>
           </w:rPr>
-          <w:instrText xml:space="preserve"> PAGEREF _Toc212934617 \h </w:instrText>
+          <w:instrText xml:space="preserve"> PAGEREF _Toc213352306 \h </w:instrText>
         </w:r>
         <w:r>
           <w:rPr>
@@ -1715,7 +1715,7 @@
           <w14:ligatures w14:val="standardContextual"/>
         </w:rPr>
       </w:pPr>
-      <w:hyperlink w:anchor="_Toc212934618" w:history="1">
+      <w:hyperlink w:anchor="_Toc213352307" w:history="1">
         <w:r>
           <w:rPr>
             <w:rStyle w:val="Lienhypertexte"/>
@@ -1762,7 +1762,7 @@
             <w:noProof/>
             <w:webHidden/>
           </w:rPr>
-          <w:instrText xml:space="preserve"> PAGEREF _Toc212934618 \h </w:instrText>
+          <w:instrText xml:space="preserve"> PAGEREF _Toc213352307 \h </w:instrText>
         </w:r>
         <w:r>
           <w:rPr>
@@ -1810,7 +1810,7 @@
           <w14:ligatures w14:val="standardContextual"/>
         </w:rPr>
       </w:pPr>
-      <w:hyperlink w:anchor="_Toc212934619" w:history="1">
+      <w:hyperlink w:anchor="_Toc213352308" w:history="1">
         <w:r>
           <w:rPr>
             <w:rStyle w:val="Lienhypertexte"/>
@@ -1856,7 +1856,7 @@
             <w:noProof/>
             <w:webHidden/>
           </w:rPr>
-          <w:instrText xml:space="preserve"> PAGEREF _Toc212934619 \h </w:instrText>
+          <w:instrText xml:space="preserve"> PAGEREF _Toc213352308 \h </w:instrText>
         </w:r>
         <w:r>
           <w:rPr>
@@ -1876,7 +1876,7 @@
             <w:noProof/>
             <w:webHidden/>
           </w:rPr>
-          <w:t>5</w:t>
+          <w:t>6</w:t>
         </w:r>
         <w:r>
           <w:rPr>
@@ -1905,7 +1905,7 @@
           <w14:ligatures w14:val="standardContextual"/>
         </w:rPr>
       </w:pPr>
-      <w:hyperlink w:anchor="_Toc212934620" w:history="1">
+      <w:hyperlink w:anchor="_Toc213352309" w:history="1">
         <w:r>
           <w:rPr>
             <w:rStyle w:val="Lienhypertexte"/>
@@ -1952,7 +1952,7 @@
             <w:noProof/>
             <w:webHidden/>
           </w:rPr>
-          <w:instrText xml:space="preserve"> PAGEREF _Toc212934620 \h </w:instrText>
+          <w:instrText xml:space="preserve"> PAGEREF _Toc213352309 \h </w:instrText>
         </w:r>
         <w:r>
           <w:rPr>
@@ -1972,7 +1972,7 @@
             <w:noProof/>
             <w:webHidden/>
           </w:rPr>
-          <w:t>6</w:t>
+          <w:t>7</w:t>
         </w:r>
         <w:r>
           <w:rPr>
@@ -2001,7 +2001,7 @@
           <w14:ligatures w14:val="standardContextual"/>
         </w:rPr>
       </w:pPr>
-      <w:hyperlink w:anchor="_Toc212934621" w:history="1">
+      <w:hyperlink w:anchor="_Toc213352310" w:history="1">
         <w:r>
           <w:rPr>
             <w:rStyle w:val="Lienhypertexte"/>
@@ -2048,7 +2048,7 @@
             <w:noProof/>
             <w:webHidden/>
           </w:rPr>
-          <w:instrText xml:space="preserve"> PAGEREF _Toc212934621 \h </w:instrText>
+          <w:instrText xml:space="preserve"> PAGEREF _Toc213352310 \h </w:instrText>
         </w:r>
         <w:r>
           <w:rPr>
@@ -2068,7 +2068,7 @@
             <w:noProof/>
             <w:webHidden/>
           </w:rPr>
-          <w:t>6</w:t>
+          <w:t>9</w:t>
         </w:r>
         <w:r>
           <w:rPr>
@@ -2097,7 +2097,7 @@
           <w14:ligatures w14:val="standardContextual"/>
         </w:rPr>
       </w:pPr>
-      <w:hyperlink w:anchor="_Toc212934622" w:history="1">
+      <w:hyperlink w:anchor="_Toc213352311" w:history="1">
         <w:r>
           <w:rPr>
             <w:rStyle w:val="Lienhypertexte"/>
@@ -2144,7 +2144,7 @@
             <w:noProof/>
             <w:webHidden/>
           </w:rPr>
-          <w:instrText xml:space="preserve"> PAGEREF _Toc212934622 \h </w:instrText>
+          <w:instrText xml:space="preserve"> PAGEREF _Toc213352311 \h </w:instrText>
         </w:r>
         <w:r>
           <w:rPr>
@@ -2164,7 +2164,7 @@
             <w:noProof/>
             <w:webHidden/>
           </w:rPr>
-          <w:t>6</w:t>
+          <w:t>10</w:t>
         </w:r>
         <w:r>
           <w:rPr>
@@ -2193,7 +2193,7 @@
           <w14:ligatures w14:val="standardContextual"/>
         </w:rPr>
       </w:pPr>
-      <w:hyperlink w:anchor="_Toc212934623" w:history="1">
+      <w:hyperlink w:anchor="_Toc213352312" w:history="1">
         <w:r>
           <w:rPr>
             <w:rStyle w:val="Lienhypertexte"/>
@@ -2240,7 +2240,7 @@
             <w:noProof/>
             <w:webHidden/>
           </w:rPr>
-          <w:instrText xml:space="preserve"> PAGEREF _Toc212934623 \h </w:instrText>
+          <w:instrText xml:space="preserve"> PAGEREF _Toc213352312 \h </w:instrText>
         </w:r>
         <w:r>
           <w:rPr>
@@ -2260,7 +2260,7 @@
             <w:noProof/>
             <w:webHidden/>
           </w:rPr>
-          <w:t>6</w:t>
+          <w:t>11</w:t>
         </w:r>
         <w:r>
           <w:rPr>
@@ -2289,7 +2289,7 @@
           <w14:ligatures w14:val="standardContextual"/>
         </w:rPr>
       </w:pPr>
-      <w:hyperlink w:anchor="_Toc212934624" w:history="1">
+      <w:hyperlink w:anchor="_Toc213352313" w:history="1">
         <w:r>
           <w:rPr>
             <w:rStyle w:val="Lienhypertexte"/>
@@ -2336,7 +2336,7 @@
             <w:noProof/>
             <w:webHidden/>
           </w:rPr>
-          <w:instrText xml:space="preserve"> PAGEREF _Toc212934624 \h </w:instrText>
+          <w:instrText xml:space="preserve"> PAGEREF _Toc213352313 \h </w:instrText>
         </w:r>
         <w:r>
           <w:rPr>
@@ -2356,7 +2356,7 @@
             <w:noProof/>
             <w:webHidden/>
           </w:rPr>
-          <w:t>6</w:t>
+          <w:t>12</w:t>
         </w:r>
         <w:r>
           <w:rPr>
@@ -2386,7 +2386,7 @@
           <w14:ligatures w14:val="standardContextual"/>
         </w:rPr>
       </w:pPr>
-      <w:hyperlink w:anchor="_Toc212934625" w:history="1">
+      <w:hyperlink w:anchor="_Toc213352314" w:history="1">
         <w:r>
           <w:rPr>
             <w:rStyle w:val="Lienhypertexte"/>
@@ -2434,7 +2434,7 @@
             <w:noProof/>
             <w:webHidden/>
           </w:rPr>
-          <w:instrText xml:space="preserve"> PAGEREF _Toc212934625 \h </w:instrText>
+          <w:instrText xml:space="preserve"> PAGEREF _Toc213352314 \h </w:instrText>
         </w:r>
         <w:r>
           <w:rPr>
@@ -2454,7 +2454,7 @@
             <w:noProof/>
             <w:webHidden/>
           </w:rPr>
-          <w:t>7</w:t>
+          <w:t>13</w:t>
         </w:r>
         <w:r>
           <w:rPr>
@@ -2482,7 +2482,7 @@
           <w14:ligatures w14:val="standardContextual"/>
         </w:rPr>
       </w:pPr>
-      <w:hyperlink w:anchor="_Toc212934626" w:history="1">
+      <w:hyperlink w:anchor="_Toc213352315" w:history="1">
         <w:r>
           <w:rPr>
             <w:rStyle w:val="Lienhypertexte"/>
@@ -2528,7 +2528,7 @@
             <w:noProof/>
             <w:webHidden/>
           </w:rPr>
-          <w:instrText xml:space="preserve"> PAGEREF _Toc212934626 \h </w:instrText>
+          <w:instrText xml:space="preserve"> PAGEREF _Toc213352315 \h </w:instrText>
         </w:r>
         <w:r>
           <w:rPr>
@@ -2548,7 +2548,7 @@
             <w:noProof/>
             <w:webHidden/>
           </w:rPr>
-          <w:t>7</w:t>
+          <w:t>13</w:t>
         </w:r>
         <w:r>
           <w:rPr>
@@ -2577,7 +2577,7 @@
           <w14:ligatures w14:val="standardContextual"/>
         </w:rPr>
       </w:pPr>
-      <w:hyperlink w:anchor="_Toc212934627" w:history="1">
+      <w:hyperlink w:anchor="_Toc213352316" w:history="1">
         <w:r>
           <w:rPr>
             <w:rStyle w:val="Lienhypertexte"/>
@@ -2624,7 +2624,7 @@
             <w:noProof/>
             <w:webHidden/>
           </w:rPr>
-          <w:instrText xml:space="preserve"> PAGEREF _Toc212934627 \h </w:instrText>
+          <w:instrText xml:space="preserve"> PAGEREF _Toc213352316 \h </w:instrText>
         </w:r>
         <w:r>
           <w:rPr>
@@ -2644,7 +2644,7 @@
             <w:noProof/>
             <w:webHidden/>
           </w:rPr>
-          <w:t>7</w:t>
+          <w:t>13</w:t>
         </w:r>
         <w:r>
           <w:rPr>
@@ -2673,7 +2673,7 @@
           <w14:ligatures w14:val="standardContextual"/>
         </w:rPr>
       </w:pPr>
-      <w:hyperlink w:anchor="_Toc212934628" w:history="1">
+      <w:hyperlink w:anchor="_Toc213352317" w:history="1">
         <w:r>
           <w:rPr>
             <w:rStyle w:val="Lienhypertexte"/>
@@ -2720,7 +2720,7 @@
             <w:noProof/>
             <w:webHidden/>
           </w:rPr>
-          <w:instrText xml:space="preserve"> PAGEREF _Toc212934628 \h </w:instrText>
+          <w:instrText xml:space="preserve"> PAGEREF _Toc213352317 \h </w:instrText>
         </w:r>
         <w:r>
           <w:rPr>
@@ -2740,7 +2740,7 @@
             <w:noProof/>
             <w:webHidden/>
           </w:rPr>
-          <w:t>7</w:t>
+          <w:t>13</w:t>
         </w:r>
         <w:r>
           <w:rPr>
@@ -2769,7 +2769,7 @@
           <w14:ligatures w14:val="standardContextual"/>
         </w:rPr>
       </w:pPr>
-      <w:hyperlink w:anchor="_Toc212934629" w:history="1">
+      <w:hyperlink w:anchor="_Toc213352318" w:history="1">
         <w:r>
           <w:rPr>
             <w:rStyle w:val="Lienhypertexte"/>
@@ -2816,7 +2816,7 @@
             <w:noProof/>
             <w:webHidden/>
           </w:rPr>
-          <w:instrText xml:space="preserve"> PAGEREF _Toc212934629 \h </w:instrText>
+          <w:instrText xml:space="preserve"> PAGEREF _Toc213352318 \h </w:instrText>
         </w:r>
         <w:r>
           <w:rPr>
@@ -2836,7 +2836,7 @@
             <w:noProof/>
             <w:webHidden/>
           </w:rPr>
-          <w:t>7</w:t>
+          <w:t>13</w:t>
         </w:r>
         <w:r>
           <w:rPr>
@@ -2865,7 +2865,7 @@
           <w14:ligatures w14:val="standardContextual"/>
         </w:rPr>
       </w:pPr>
-      <w:hyperlink w:anchor="_Toc212934630" w:history="1">
+      <w:hyperlink w:anchor="_Toc213352319" w:history="1">
         <w:r>
           <w:rPr>
             <w:rStyle w:val="Lienhypertexte"/>
@@ -2912,7 +2912,7 @@
             <w:noProof/>
             <w:webHidden/>
           </w:rPr>
-          <w:instrText xml:space="preserve"> PAGEREF _Toc212934630 \h </w:instrText>
+          <w:instrText xml:space="preserve"> PAGEREF _Toc213352319 \h </w:instrText>
         </w:r>
         <w:r>
           <w:rPr>
@@ -2932,7 +2932,7 @@
             <w:noProof/>
             <w:webHidden/>
           </w:rPr>
-          <w:t>7</w:t>
+          <w:t>13</w:t>
         </w:r>
         <w:r>
           <w:rPr>
@@ -2961,7 +2961,7 @@
           <w14:ligatures w14:val="standardContextual"/>
         </w:rPr>
       </w:pPr>
-      <w:hyperlink w:anchor="_Toc212934631" w:history="1">
+      <w:hyperlink w:anchor="_Toc213352320" w:history="1">
         <w:r>
           <w:rPr>
             <w:rStyle w:val="Lienhypertexte"/>
@@ -3008,7 +3008,7 @@
             <w:noProof/>
             <w:webHidden/>
           </w:rPr>
-          <w:instrText xml:space="preserve"> PAGEREF _Toc212934631 \h </w:instrText>
+          <w:instrText xml:space="preserve"> PAGEREF _Toc213352320 \h </w:instrText>
         </w:r>
         <w:r>
           <w:rPr>
@@ -3028,7 +3028,7 @@
             <w:noProof/>
             <w:webHidden/>
           </w:rPr>
-          <w:t>8</w:t>
+          <w:t>13</w:t>
         </w:r>
         <w:r>
           <w:rPr>
@@ -3056,7 +3056,7 @@
           <w14:ligatures w14:val="standardContextual"/>
         </w:rPr>
       </w:pPr>
-      <w:hyperlink w:anchor="_Toc212934632" w:history="1">
+      <w:hyperlink w:anchor="_Toc213352321" w:history="1">
         <w:r>
           <w:rPr>
             <w:rStyle w:val="Lienhypertexte"/>
@@ -3102,7 +3102,7 @@
             <w:noProof/>
             <w:webHidden/>
           </w:rPr>
-          <w:instrText xml:space="preserve"> PAGEREF _Toc212934632 \h </w:instrText>
+          <w:instrText xml:space="preserve"> PAGEREF _Toc213352321 \h </w:instrText>
         </w:r>
         <w:r>
           <w:rPr>
@@ -3122,7 +3122,7 @@
             <w:noProof/>
             <w:webHidden/>
           </w:rPr>
-          <w:t>8</w:t>
+          <w:t>14</w:t>
         </w:r>
         <w:r>
           <w:rPr>
@@ -3151,7 +3151,7 @@
           <w14:ligatures w14:val="standardContextual"/>
         </w:rPr>
       </w:pPr>
-      <w:hyperlink w:anchor="_Toc212934633" w:history="1">
+      <w:hyperlink w:anchor="_Toc213352322" w:history="1">
         <w:r>
           <w:rPr>
             <w:rStyle w:val="Lienhypertexte"/>
@@ -3198,7 +3198,7 @@
             <w:noProof/>
             <w:webHidden/>
           </w:rPr>
-          <w:instrText xml:space="preserve"> PAGEREF _Toc212934633 \h </w:instrText>
+          <w:instrText xml:space="preserve"> PAGEREF _Toc213352322 \h </w:instrText>
         </w:r>
         <w:r>
           <w:rPr>
@@ -3218,7 +3218,7 @@
             <w:noProof/>
             <w:webHidden/>
           </w:rPr>
-          <w:t>8</w:t>
+          <w:t>14</w:t>
         </w:r>
         <w:r>
           <w:rPr>
@@ -3247,7 +3247,7 @@
           <w14:ligatures w14:val="standardContextual"/>
         </w:rPr>
       </w:pPr>
-      <w:hyperlink w:anchor="_Toc212934634" w:history="1">
+      <w:hyperlink w:anchor="_Toc213352323" w:history="1">
         <w:r>
           <w:rPr>
             <w:rStyle w:val="Lienhypertexte"/>
@@ -3294,7 +3294,7 @@
             <w:noProof/>
             <w:webHidden/>
           </w:rPr>
-          <w:instrText xml:space="preserve"> PAGEREF _Toc212934634 \h </w:instrText>
+          <w:instrText xml:space="preserve"> PAGEREF _Toc213352323 \h </w:instrText>
         </w:r>
         <w:r>
           <w:rPr>
@@ -3314,7 +3314,7 @@
             <w:noProof/>
             <w:webHidden/>
           </w:rPr>
-          <w:t>8</w:t>
+          <w:t>14</w:t>
         </w:r>
         <w:r>
           <w:rPr>
@@ -3343,7 +3343,7 @@
           <w14:ligatures w14:val="standardContextual"/>
         </w:rPr>
       </w:pPr>
-      <w:hyperlink w:anchor="_Toc212934635" w:history="1">
+      <w:hyperlink w:anchor="_Toc213352324" w:history="1">
         <w:r>
           <w:rPr>
             <w:rStyle w:val="Lienhypertexte"/>
@@ -3390,7 +3390,7 @@
             <w:noProof/>
             <w:webHidden/>
           </w:rPr>
-          <w:instrText xml:space="preserve"> PAGEREF _Toc212934635 \h </w:instrText>
+          <w:instrText xml:space="preserve"> PAGEREF _Toc213352324 \h </w:instrText>
         </w:r>
         <w:r>
           <w:rPr>
@@ -3410,7 +3410,7 @@
             <w:noProof/>
             <w:webHidden/>
           </w:rPr>
-          <w:t>8</w:t>
+          <w:t>14</w:t>
         </w:r>
         <w:r>
           <w:rPr>
@@ -3439,7 +3439,7 @@
           <w14:ligatures w14:val="standardContextual"/>
         </w:rPr>
       </w:pPr>
-      <w:hyperlink w:anchor="_Toc212934636" w:history="1">
+      <w:hyperlink w:anchor="_Toc213352325" w:history="1">
         <w:r>
           <w:rPr>
             <w:rStyle w:val="Lienhypertexte"/>
@@ -3486,7 +3486,7 @@
             <w:noProof/>
             <w:webHidden/>
           </w:rPr>
-          <w:instrText xml:space="preserve"> PAGEREF _Toc212934636 \h </w:instrText>
+          <w:instrText xml:space="preserve"> PAGEREF _Toc213352325 \h </w:instrText>
         </w:r>
         <w:r>
           <w:rPr>
@@ -3506,7 +3506,7 @@
             <w:noProof/>
             <w:webHidden/>
           </w:rPr>
-          <w:t>9</w:t>
+          <w:t>14</w:t>
         </w:r>
         <w:r>
           <w:rPr>
@@ -3536,7 +3536,7 @@
           <w14:ligatures w14:val="standardContextual"/>
         </w:rPr>
       </w:pPr>
-      <w:hyperlink w:anchor="_Toc212934637" w:history="1">
+      <w:hyperlink w:anchor="_Toc213352326" w:history="1">
         <w:r>
           <w:rPr>
             <w:rStyle w:val="Lienhypertexte"/>
@@ -3584,7 +3584,7 @@
             <w:noProof/>
             <w:webHidden/>
           </w:rPr>
-          <w:instrText xml:space="preserve"> PAGEREF _Toc212934637 \h </w:instrText>
+          <w:instrText xml:space="preserve"> PAGEREF _Toc213352326 \h </w:instrText>
         </w:r>
         <w:r>
           <w:rPr>
@@ -3604,7 +3604,7 @@
             <w:noProof/>
             <w:webHidden/>
           </w:rPr>
-          <w:t>9</w:t>
+          <w:t>15</w:t>
         </w:r>
         <w:r>
           <w:rPr>
@@ -3632,7 +3632,7 @@
           <w14:ligatures w14:val="standardContextual"/>
         </w:rPr>
       </w:pPr>
-      <w:hyperlink w:anchor="_Toc212934638" w:history="1">
+      <w:hyperlink w:anchor="_Toc213352327" w:history="1">
         <w:r>
           <w:rPr>
             <w:rStyle w:val="Lienhypertexte"/>
@@ -3678,7 +3678,7 @@
             <w:noProof/>
             <w:webHidden/>
           </w:rPr>
-          <w:instrText xml:space="preserve"> PAGEREF _Toc212934638 \h </w:instrText>
+          <w:instrText xml:space="preserve"> PAGEREF _Toc213352327 \h </w:instrText>
         </w:r>
         <w:r>
           <w:rPr>
@@ -3698,7 +3698,7 @@
             <w:noProof/>
             <w:webHidden/>
           </w:rPr>
-          <w:t>9</w:t>
+          <w:t>15</w:t>
         </w:r>
         <w:r>
           <w:rPr>
@@ -3726,7 +3726,7 @@
           <w14:ligatures w14:val="standardContextual"/>
         </w:rPr>
       </w:pPr>
-      <w:hyperlink w:anchor="_Toc212934639" w:history="1">
+      <w:hyperlink w:anchor="_Toc213352328" w:history="1">
         <w:r>
           <w:rPr>
             <w:rStyle w:val="Lienhypertexte"/>
@@ -3772,7 +3772,7 @@
             <w:noProof/>
             <w:webHidden/>
           </w:rPr>
-          <w:instrText xml:space="preserve"> PAGEREF _Toc212934639 \h </w:instrText>
+          <w:instrText xml:space="preserve"> PAGEREF _Toc213352328 \h </w:instrText>
         </w:r>
         <w:r>
           <w:rPr>
@@ -3792,7 +3792,7 @@
             <w:noProof/>
             <w:webHidden/>
           </w:rPr>
-          <w:t>9</w:t>
+          <w:t>15</w:t>
         </w:r>
         <w:r>
           <w:rPr>
@@ -3820,7 +3820,7 @@
           <w14:ligatures w14:val="standardContextual"/>
         </w:rPr>
       </w:pPr>
-      <w:hyperlink w:anchor="_Toc212934640" w:history="1">
+      <w:hyperlink w:anchor="_Toc213352329" w:history="1">
         <w:r>
           <w:rPr>
             <w:rStyle w:val="Lienhypertexte"/>
@@ -3866,7 +3866,7 @@
             <w:noProof/>
             <w:webHidden/>
           </w:rPr>
-          <w:instrText xml:space="preserve"> PAGEREF _Toc212934640 \h </w:instrText>
+          <w:instrText xml:space="preserve"> PAGEREF _Toc213352329 \h </w:instrText>
         </w:r>
         <w:r>
           <w:rPr>
@@ -3886,7 +3886,7 @@
             <w:noProof/>
             <w:webHidden/>
           </w:rPr>
-          <w:t>9</w:t>
+          <w:t>15</w:t>
         </w:r>
         <w:r>
           <w:rPr>
@@ -3916,7 +3916,7 @@
           <w14:ligatures w14:val="standardContextual"/>
         </w:rPr>
       </w:pPr>
-      <w:hyperlink w:anchor="_Toc212934641" w:history="1">
+      <w:hyperlink w:anchor="_Toc213352330" w:history="1">
         <w:r>
           <w:rPr>
             <w:rStyle w:val="Lienhypertexte"/>
@@ -3964,7 +3964,7 @@
             <w:noProof/>
             <w:webHidden/>
           </w:rPr>
-          <w:instrText xml:space="preserve"> PAGEREF _Toc212934641 \h </w:instrText>
+          <w:instrText xml:space="preserve"> PAGEREF _Toc213352330 \h </w:instrText>
         </w:r>
         <w:r>
           <w:rPr>
@@ -3984,7 +3984,7 @@
             <w:noProof/>
             <w:webHidden/>
           </w:rPr>
-          <w:t>9</w:t>
+          <w:t>15</w:t>
         </w:r>
         <w:r>
           <w:rPr>
@@ -4012,7 +4012,7 @@
           <w14:ligatures w14:val="standardContextual"/>
         </w:rPr>
       </w:pPr>
-      <w:hyperlink w:anchor="_Toc212934642" w:history="1">
+      <w:hyperlink w:anchor="_Toc213352331" w:history="1">
         <w:r>
           <w:rPr>
             <w:rStyle w:val="Lienhypertexte"/>
@@ -4058,7 +4058,7 @@
             <w:noProof/>
             <w:webHidden/>
           </w:rPr>
-          <w:instrText xml:space="preserve"> PAGEREF _Toc212934642 \h </w:instrText>
+          <w:instrText xml:space="preserve"> PAGEREF _Toc213352331 \h </w:instrText>
         </w:r>
         <w:r>
           <w:rPr>
@@ -4078,7 +4078,7 @@
             <w:noProof/>
             <w:webHidden/>
           </w:rPr>
-          <w:t>9</w:t>
+          <w:t>15</w:t>
         </w:r>
         <w:r>
           <w:rPr>
@@ -4106,7 +4106,7 @@
           <w14:ligatures w14:val="standardContextual"/>
         </w:rPr>
       </w:pPr>
-      <w:hyperlink w:anchor="_Toc212934643" w:history="1">
+      <w:hyperlink w:anchor="_Toc213352332" w:history="1">
         <w:r>
           <w:rPr>
             <w:rStyle w:val="Lienhypertexte"/>
@@ -4152,7 +4152,7 @@
             <w:noProof/>
             <w:webHidden/>
           </w:rPr>
-          <w:instrText xml:space="preserve"> PAGEREF _Toc212934643 \h </w:instrText>
+          <w:instrText xml:space="preserve"> PAGEREF _Toc213352332 \h </w:instrText>
         </w:r>
         <w:r>
           <w:rPr>
@@ -4172,7 +4172,7 @@
             <w:noProof/>
             <w:webHidden/>
           </w:rPr>
-          <w:t>9</w:t>
+          <w:t>15</w:t>
         </w:r>
         <w:r>
           <w:rPr>
@@ -4185,16 +4185,14 @@
     </w:p>
     <w:p>
       <w:pPr>
-        <w:pStyle w:val="TM10"/>
+        <w:pStyle w:val="TM2"/>
         <w:tabs>
-          <w:tab w:val="left" w:pos="400"/>
+          <w:tab w:val="left" w:pos="800"/>
           <w:tab w:val="right" w:leader="dot" w:pos="9060"/>
         </w:tabs>
         <w:rPr>
           <w:rFonts w:asciiTheme="minorHAnsi" w:eastAsiaTheme="minorEastAsia" w:hAnsiTheme="minorHAnsi" w:cstheme="minorBidi"/>
-          <w:b w:val="0"/>
-          <w:bCs w:val="0"/>
-          <w:caps w:val="0"/>
+          <w:smallCaps w:val="0"/>
           <w:noProof/>
           <w:kern w:val="2"/>
           <w:sz w:val="24"/>
@@ -4202,20 +4200,18 @@
           <w14:ligatures w14:val="standardContextual"/>
         </w:rPr>
       </w:pPr>
-      <w:hyperlink w:anchor="_Toc212934644" w:history="1">
+      <w:hyperlink w:anchor="_Toc213352333" w:history="1">
         <w:r>
           <w:rPr>
             <w:rStyle w:val="Lienhypertexte"/>
             <w:noProof/>
           </w:rPr>
-          <w:t>6</w:t>
+          <w:t>5.3</w:t>
         </w:r>
         <w:r>
           <w:rPr>
             <w:rFonts w:asciiTheme="minorHAnsi" w:eastAsiaTheme="minorEastAsia" w:hAnsiTheme="minorHAnsi" w:cstheme="minorBidi"/>
-            <w:b w:val="0"/>
-            <w:bCs w:val="0"/>
-            <w:caps w:val="0"/>
+            <w:smallCaps w:val="0"/>
             <w:noProof/>
             <w:kern w:val="2"/>
             <w:sz w:val="24"/>
@@ -4229,7 +4225,7 @@
             <w:rStyle w:val="Lienhypertexte"/>
             <w:noProof/>
           </w:rPr>
-          <w:t>Annexes</w:t>
+          <w:t>Utilisation de l’IA</w:t>
         </w:r>
         <w:r>
           <w:rPr>
@@ -4250,7 +4246,7 @@
             <w:noProof/>
             <w:webHidden/>
           </w:rPr>
-          <w:instrText xml:space="preserve"> PAGEREF _Toc212934644 \h </w:instrText>
+          <w:instrText xml:space="preserve"> PAGEREF _Toc213352333 \h </w:instrText>
         </w:r>
         <w:r>
           <w:rPr>
@@ -4270,7 +4266,7 @@
             <w:noProof/>
             <w:webHidden/>
           </w:rPr>
-          <w:t>9</w:t>
+          <w:t>15</w:t>
         </w:r>
         <w:r>
           <w:rPr>
@@ -4282,30 +4278,791 @@
       </w:hyperlink>
     </w:p>
     <w:p>
-      <w:r>
+      <w:pPr>
+        <w:pStyle w:val="TM3"/>
+        <w:tabs>
+          <w:tab w:val="left" w:pos="1200"/>
+          <w:tab w:val="right" w:leader="dot" w:pos="9060"/>
+        </w:tabs>
         <w:rPr>
-          <w:rFonts w:cs="Arial"/>
+          <w:rFonts w:asciiTheme="minorHAnsi" w:eastAsiaTheme="minorEastAsia" w:hAnsiTheme="minorHAnsi" w:cstheme="minorBidi"/>
+          <w:i w:val="0"/>
+          <w:iCs w:val="0"/>
+          <w:noProof/>
+          <w:kern w:val="2"/>
+          <w:sz w:val="24"/>
+          <w:szCs w:val="24"/>
+          <w14:ligatures w14:val="standardContextual"/>
+        </w:rPr>
+      </w:pPr>
+      <w:hyperlink w:anchor="_Toc213352334" w:history="1">
+        <w:r>
+          <w:rPr>
+            <w:rStyle w:val="Lienhypertexte"/>
+            <w:noProof/>
+          </w:rPr>
+          <w:t>5.3.1</w:t>
+        </w:r>
+        <w:r>
+          <w:rPr>
+            <w:rFonts w:asciiTheme="minorHAnsi" w:eastAsiaTheme="minorEastAsia" w:hAnsiTheme="minorHAnsi" w:cstheme="minorBidi"/>
+            <w:i w:val="0"/>
+            <w:iCs w:val="0"/>
+            <w:noProof/>
+            <w:kern w:val="2"/>
+            <w:sz w:val="24"/>
+            <w:szCs w:val="24"/>
+            <w14:ligatures w14:val="standardContextual"/>
+          </w:rPr>
+          <w:tab/>
+        </w:r>
+        <w:r>
+          <w:rPr>
+            <w:rStyle w:val="Lienhypertexte"/>
+            <w:noProof/>
+          </w:rPr>
+          <w:t>Requête 1</w:t>
+        </w:r>
+        <w:r>
+          <w:rPr>
+            <w:noProof/>
+            <w:webHidden/>
+          </w:rPr>
+          <w:tab/>
+        </w:r>
+        <w:r>
+          <w:rPr>
+            <w:noProof/>
+            <w:webHidden/>
+          </w:rPr>
+          <w:fldChar w:fldCharType="begin"/>
+        </w:r>
+        <w:r>
+          <w:rPr>
+            <w:noProof/>
+            <w:webHidden/>
+          </w:rPr>
+          <w:instrText xml:space="preserve"> PAGEREF _Toc213352334 \h </w:instrText>
+        </w:r>
+        <w:r>
+          <w:rPr>
+            <w:noProof/>
+            <w:webHidden/>
+          </w:rPr>
+        </w:r>
+        <w:r>
+          <w:rPr>
+            <w:noProof/>
+            <w:webHidden/>
+          </w:rPr>
+          <w:fldChar w:fldCharType="separate"/>
+        </w:r>
+        <w:r>
+          <w:rPr>
+            <w:noProof/>
+            <w:webHidden/>
+          </w:rPr>
+          <w:t>16</w:t>
+        </w:r>
+        <w:r>
+          <w:rPr>
+            <w:noProof/>
+            <w:webHidden/>
+          </w:rPr>
+          <w:fldChar w:fldCharType="end"/>
+        </w:r>
+      </w:hyperlink>
+    </w:p>
+    <w:p>
+      <w:pPr>
+        <w:pStyle w:val="TM3"/>
+        <w:tabs>
+          <w:tab w:val="left" w:pos="1200"/>
+          <w:tab w:val="right" w:leader="dot" w:pos="9060"/>
+        </w:tabs>
+        <w:rPr>
+          <w:rFonts w:asciiTheme="minorHAnsi" w:eastAsiaTheme="minorEastAsia" w:hAnsiTheme="minorHAnsi" w:cstheme="minorBidi"/>
+          <w:i w:val="0"/>
+          <w:iCs w:val="0"/>
+          <w:noProof/>
+          <w:kern w:val="2"/>
+          <w:sz w:val="24"/>
+          <w:szCs w:val="24"/>
+          <w14:ligatures w14:val="standardContextual"/>
+        </w:rPr>
+      </w:pPr>
+      <w:hyperlink w:anchor="_Toc213352335" w:history="1">
+        <w:r>
+          <w:rPr>
+            <w:rStyle w:val="Lienhypertexte"/>
+            <w:noProof/>
+          </w:rPr>
+          <w:t>5.3.2</w:t>
+        </w:r>
+        <w:r>
+          <w:rPr>
+            <w:rFonts w:asciiTheme="minorHAnsi" w:eastAsiaTheme="minorEastAsia" w:hAnsiTheme="minorHAnsi" w:cstheme="minorBidi"/>
+            <w:i w:val="0"/>
+            <w:iCs w:val="0"/>
+            <w:noProof/>
+            <w:kern w:val="2"/>
+            <w:sz w:val="24"/>
+            <w:szCs w:val="24"/>
+            <w14:ligatures w14:val="standardContextual"/>
+          </w:rPr>
+          <w:tab/>
+        </w:r>
+        <w:r>
+          <w:rPr>
+            <w:rStyle w:val="Lienhypertexte"/>
+            <w:noProof/>
+          </w:rPr>
+          <w:t>Requête 2</w:t>
+        </w:r>
+        <w:r>
+          <w:rPr>
+            <w:noProof/>
+            <w:webHidden/>
+          </w:rPr>
+          <w:tab/>
+        </w:r>
+        <w:r>
+          <w:rPr>
+            <w:noProof/>
+            <w:webHidden/>
+          </w:rPr>
+          <w:fldChar w:fldCharType="begin"/>
+        </w:r>
+        <w:r>
+          <w:rPr>
+            <w:noProof/>
+            <w:webHidden/>
+          </w:rPr>
+          <w:instrText xml:space="preserve"> PAGEREF _Toc213352335 \h </w:instrText>
+        </w:r>
+        <w:r>
+          <w:rPr>
+            <w:noProof/>
+            <w:webHidden/>
+          </w:rPr>
+        </w:r>
+        <w:r>
+          <w:rPr>
+            <w:noProof/>
+            <w:webHidden/>
+          </w:rPr>
+          <w:fldChar w:fldCharType="separate"/>
+        </w:r>
+        <w:r>
+          <w:rPr>
+            <w:noProof/>
+            <w:webHidden/>
+          </w:rPr>
+          <w:t>18</w:t>
+        </w:r>
+        <w:r>
+          <w:rPr>
+            <w:noProof/>
+            <w:webHidden/>
+          </w:rPr>
+          <w:fldChar w:fldCharType="end"/>
+        </w:r>
+      </w:hyperlink>
+    </w:p>
+    <w:p>
+      <w:pPr>
+        <w:pStyle w:val="TM3"/>
+        <w:tabs>
+          <w:tab w:val="left" w:pos="1200"/>
+          <w:tab w:val="right" w:leader="dot" w:pos="9060"/>
+        </w:tabs>
+        <w:rPr>
+          <w:rFonts w:asciiTheme="minorHAnsi" w:eastAsiaTheme="minorEastAsia" w:hAnsiTheme="minorHAnsi" w:cstheme="minorBidi"/>
+          <w:i w:val="0"/>
+          <w:iCs w:val="0"/>
+          <w:noProof/>
+          <w:kern w:val="2"/>
+          <w:sz w:val="24"/>
+          <w:szCs w:val="24"/>
+          <w14:ligatures w14:val="standardContextual"/>
+        </w:rPr>
+      </w:pPr>
+      <w:hyperlink w:anchor="_Toc213352336" w:history="1">
+        <w:r>
+          <w:rPr>
+            <w:rStyle w:val="Lienhypertexte"/>
+            <w:noProof/>
+          </w:rPr>
+          <w:t>5.3.3</w:t>
+        </w:r>
+        <w:r>
+          <w:rPr>
+            <w:rFonts w:asciiTheme="minorHAnsi" w:eastAsiaTheme="minorEastAsia" w:hAnsiTheme="minorHAnsi" w:cstheme="minorBidi"/>
+            <w:i w:val="0"/>
+            <w:iCs w:val="0"/>
+            <w:noProof/>
+            <w:kern w:val="2"/>
+            <w:sz w:val="24"/>
+            <w:szCs w:val="24"/>
+            <w14:ligatures w14:val="standardContextual"/>
+          </w:rPr>
+          <w:tab/>
+        </w:r>
+        <w:r>
+          <w:rPr>
+            <w:rStyle w:val="Lienhypertexte"/>
+            <w:noProof/>
+          </w:rPr>
+          <w:t>Requête 3</w:t>
+        </w:r>
+        <w:r>
+          <w:rPr>
+            <w:noProof/>
+            <w:webHidden/>
+          </w:rPr>
+          <w:tab/>
+        </w:r>
+        <w:r>
+          <w:rPr>
+            <w:noProof/>
+            <w:webHidden/>
+          </w:rPr>
+          <w:fldChar w:fldCharType="begin"/>
+        </w:r>
+        <w:r>
+          <w:rPr>
+            <w:noProof/>
+            <w:webHidden/>
+          </w:rPr>
+          <w:instrText xml:space="preserve"> PAGEREF _Toc213352336 \h </w:instrText>
+        </w:r>
+        <w:r>
+          <w:rPr>
+            <w:noProof/>
+            <w:webHidden/>
+          </w:rPr>
+        </w:r>
+        <w:r>
+          <w:rPr>
+            <w:noProof/>
+            <w:webHidden/>
+          </w:rPr>
+          <w:fldChar w:fldCharType="separate"/>
+        </w:r>
+        <w:r>
+          <w:rPr>
+            <w:noProof/>
+            <w:webHidden/>
+          </w:rPr>
+          <w:t>19</w:t>
+        </w:r>
+        <w:r>
+          <w:rPr>
+            <w:noProof/>
+            <w:webHidden/>
+          </w:rPr>
+          <w:fldChar w:fldCharType="end"/>
+        </w:r>
+      </w:hyperlink>
+    </w:p>
+    <w:p>
+      <w:pPr>
+        <w:pStyle w:val="TM3"/>
+        <w:tabs>
+          <w:tab w:val="left" w:pos="1200"/>
+          <w:tab w:val="right" w:leader="dot" w:pos="9060"/>
+        </w:tabs>
+        <w:rPr>
+          <w:rFonts w:asciiTheme="minorHAnsi" w:eastAsiaTheme="minorEastAsia" w:hAnsiTheme="minorHAnsi" w:cstheme="minorBidi"/>
+          <w:i w:val="0"/>
+          <w:iCs w:val="0"/>
+          <w:noProof/>
+          <w:kern w:val="2"/>
+          <w:sz w:val="24"/>
+          <w:szCs w:val="24"/>
+          <w14:ligatures w14:val="standardContextual"/>
+        </w:rPr>
+      </w:pPr>
+      <w:hyperlink w:anchor="_Toc213352337" w:history="1">
+        <w:r>
+          <w:rPr>
+            <w:rStyle w:val="Lienhypertexte"/>
+            <w:noProof/>
+          </w:rPr>
+          <w:t>5.3.4</w:t>
+        </w:r>
+        <w:r>
+          <w:rPr>
+            <w:rFonts w:asciiTheme="minorHAnsi" w:eastAsiaTheme="minorEastAsia" w:hAnsiTheme="minorHAnsi" w:cstheme="minorBidi"/>
+            <w:i w:val="0"/>
+            <w:iCs w:val="0"/>
+            <w:noProof/>
+            <w:kern w:val="2"/>
+            <w:sz w:val="24"/>
+            <w:szCs w:val="24"/>
+            <w14:ligatures w14:val="standardContextual"/>
+          </w:rPr>
+          <w:tab/>
+        </w:r>
+        <w:r>
+          <w:rPr>
+            <w:rStyle w:val="Lienhypertexte"/>
+            <w:noProof/>
+          </w:rPr>
+          <w:t>Requête 4</w:t>
+        </w:r>
+        <w:r>
+          <w:rPr>
+            <w:noProof/>
+            <w:webHidden/>
+          </w:rPr>
+          <w:tab/>
+        </w:r>
+        <w:r>
+          <w:rPr>
+            <w:noProof/>
+            <w:webHidden/>
+          </w:rPr>
+          <w:fldChar w:fldCharType="begin"/>
+        </w:r>
+        <w:r>
+          <w:rPr>
+            <w:noProof/>
+            <w:webHidden/>
+          </w:rPr>
+          <w:instrText xml:space="preserve"> PAGEREF _Toc213352337 \h </w:instrText>
+        </w:r>
+        <w:r>
+          <w:rPr>
+            <w:noProof/>
+            <w:webHidden/>
+          </w:rPr>
+        </w:r>
+        <w:r>
+          <w:rPr>
+            <w:noProof/>
+            <w:webHidden/>
+          </w:rPr>
+          <w:fldChar w:fldCharType="separate"/>
+        </w:r>
+        <w:r>
+          <w:rPr>
+            <w:noProof/>
+            <w:webHidden/>
+          </w:rPr>
+          <w:t>19</w:t>
+        </w:r>
+        <w:r>
+          <w:rPr>
+            <w:noProof/>
+            <w:webHidden/>
+          </w:rPr>
+          <w:fldChar w:fldCharType="end"/>
+        </w:r>
+      </w:hyperlink>
+    </w:p>
+    <w:p>
+      <w:pPr>
+        <w:pStyle w:val="TM3"/>
+        <w:tabs>
+          <w:tab w:val="left" w:pos="1200"/>
+          <w:tab w:val="right" w:leader="dot" w:pos="9060"/>
+        </w:tabs>
+        <w:rPr>
+          <w:rFonts w:asciiTheme="minorHAnsi" w:eastAsiaTheme="minorEastAsia" w:hAnsiTheme="minorHAnsi" w:cstheme="minorBidi"/>
+          <w:i w:val="0"/>
+          <w:iCs w:val="0"/>
+          <w:noProof/>
+          <w:kern w:val="2"/>
+          <w:sz w:val="24"/>
+          <w:szCs w:val="24"/>
+          <w14:ligatures w14:val="standardContextual"/>
+        </w:rPr>
+      </w:pPr>
+      <w:hyperlink w:anchor="_Toc213352338" w:history="1">
+        <w:r>
+          <w:rPr>
+            <w:rStyle w:val="Lienhypertexte"/>
+            <w:noProof/>
+          </w:rPr>
+          <w:t>5.3.5</w:t>
+        </w:r>
+        <w:r>
+          <w:rPr>
+            <w:rFonts w:asciiTheme="minorHAnsi" w:eastAsiaTheme="minorEastAsia" w:hAnsiTheme="minorHAnsi" w:cstheme="minorBidi"/>
+            <w:i w:val="0"/>
+            <w:iCs w:val="0"/>
+            <w:noProof/>
+            <w:kern w:val="2"/>
+            <w:sz w:val="24"/>
+            <w:szCs w:val="24"/>
+            <w14:ligatures w14:val="standardContextual"/>
+          </w:rPr>
+          <w:tab/>
+        </w:r>
+        <w:r>
+          <w:rPr>
+            <w:rStyle w:val="Lienhypertexte"/>
+            <w:noProof/>
+          </w:rPr>
+          <w:t>Requête 5</w:t>
+        </w:r>
+        <w:r>
+          <w:rPr>
+            <w:noProof/>
+            <w:webHidden/>
+          </w:rPr>
+          <w:tab/>
+        </w:r>
+        <w:r>
+          <w:rPr>
+            <w:noProof/>
+            <w:webHidden/>
+          </w:rPr>
+          <w:fldChar w:fldCharType="begin"/>
+        </w:r>
+        <w:r>
+          <w:rPr>
+            <w:noProof/>
+            <w:webHidden/>
+          </w:rPr>
+          <w:instrText xml:space="preserve"> PAGEREF _Toc213352338 \h </w:instrText>
+        </w:r>
+        <w:r>
+          <w:rPr>
+            <w:noProof/>
+            <w:webHidden/>
+          </w:rPr>
+        </w:r>
+        <w:r>
+          <w:rPr>
+            <w:noProof/>
+            <w:webHidden/>
+          </w:rPr>
+          <w:fldChar w:fldCharType="separate"/>
+        </w:r>
+        <w:r>
+          <w:rPr>
+            <w:noProof/>
+            <w:webHidden/>
+          </w:rPr>
+          <w:t>22</w:t>
+        </w:r>
+        <w:r>
+          <w:rPr>
+            <w:noProof/>
+            <w:webHidden/>
+          </w:rPr>
+          <w:fldChar w:fldCharType="end"/>
+        </w:r>
+      </w:hyperlink>
+    </w:p>
+    <w:p>
+      <w:pPr>
+        <w:pStyle w:val="TM3"/>
+        <w:tabs>
+          <w:tab w:val="left" w:pos="1200"/>
+          <w:tab w:val="right" w:leader="dot" w:pos="9060"/>
+        </w:tabs>
+        <w:rPr>
+          <w:rFonts w:asciiTheme="minorHAnsi" w:eastAsiaTheme="minorEastAsia" w:hAnsiTheme="minorHAnsi" w:cstheme="minorBidi"/>
+          <w:i w:val="0"/>
+          <w:iCs w:val="0"/>
+          <w:noProof/>
+          <w:kern w:val="2"/>
+          <w:sz w:val="24"/>
+          <w:szCs w:val="24"/>
+          <w14:ligatures w14:val="standardContextual"/>
+        </w:rPr>
+      </w:pPr>
+      <w:hyperlink w:anchor="_Toc213352339" w:history="1">
+        <w:r>
+          <w:rPr>
+            <w:rStyle w:val="Lienhypertexte"/>
+            <w:noProof/>
+          </w:rPr>
+          <w:t>5.3.6</w:t>
+        </w:r>
+        <w:r>
+          <w:rPr>
+            <w:rFonts w:asciiTheme="minorHAnsi" w:eastAsiaTheme="minorEastAsia" w:hAnsiTheme="minorHAnsi" w:cstheme="minorBidi"/>
+            <w:i w:val="0"/>
+            <w:iCs w:val="0"/>
+            <w:noProof/>
+            <w:kern w:val="2"/>
+            <w:sz w:val="24"/>
+            <w:szCs w:val="24"/>
+            <w14:ligatures w14:val="standardContextual"/>
+          </w:rPr>
+          <w:tab/>
+        </w:r>
+        <w:r>
+          <w:rPr>
+            <w:rStyle w:val="Lienhypertexte"/>
+            <w:noProof/>
+          </w:rPr>
+          <w:t>Requête 6</w:t>
+        </w:r>
+        <w:r>
+          <w:rPr>
+            <w:noProof/>
+            <w:webHidden/>
+          </w:rPr>
+          <w:tab/>
+        </w:r>
+        <w:r>
+          <w:rPr>
+            <w:noProof/>
+            <w:webHidden/>
+          </w:rPr>
+          <w:fldChar w:fldCharType="begin"/>
+        </w:r>
+        <w:r>
+          <w:rPr>
+            <w:noProof/>
+            <w:webHidden/>
+          </w:rPr>
+          <w:instrText xml:space="preserve"> PAGEREF _Toc213352339 \h </w:instrText>
+        </w:r>
+        <w:r>
+          <w:rPr>
+            <w:noProof/>
+            <w:webHidden/>
+          </w:rPr>
+        </w:r>
+        <w:r>
+          <w:rPr>
+            <w:noProof/>
+            <w:webHidden/>
+          </w:rPr>
+          <w:fldChar w:fldCharType="separate"/>
+        </w:r>
+        <w:r>
+          <w:rPr>
+            <w:noProof/>
+            <w:webHidden/>
+          </w:rPr>
+          <w:t>23</w:t>
+        </w:r>
+        <w:r>
+          <w:rPr>
+            <w:noProof/>
+            <w:webHidden/>
+          </w:rPr>
+          <w:fldChar w:fldCharType="end"/>
+        </w:r>
+      </w:hyperlink>
+    </w:p>
+    <w:p>
+      <w:pPr>
+        <w:pStyle w:val="TM3"/>
+        <w:tabs>
+          <w:tab w:val="left" w:pos="1200"/>
+          <w:tab w:val="right" w:leader="dot" w:pos="9060"/>
+        </w:tabs>
+        <w:rPr>
+          <w:rFonts w:asciiTheme="minorHAnsi" w:eastAsiaTheme="minorEastAsia" w:hAnsiTheme="minorHAnsi" w:cstheme="minorBidi"/>
+          <w:i w:val="0"/>
+          <w:iCs w:val="0"/>
+          <w:noProof/>
+          <w:kern w:val="2"/>
+          <w:sz w:val="24"/>
+          <w:szCs w:val="24"/>
+          <w14:ligatures w14:val="standardContextual"/>
+        </w:rPr>
+      </w:pPr>
+      <w:hyperlink w:anchor="_Toc213352340" w:history="1">
+        <w:r>
+          <w:rPr>
+            <w:rStyle w:val="Lienhypertexte"/>
+            <w:noProof/>
+          </w:rPr>
+          <w:t>5.3.7</w:t>
+        </w:r>
+        <w:r>
+          <w:rPr>
+            <w:rFonts w:asciiTheme="minorHAnsi" w:eastAsiaTheme="minorEastAsia" w:hAnsiTheme="minorHAnsi" w:cstheme="minorBidi"/>
+            <w:i w:val="0"/>
+            <w:iCs w:val="0"/>
+            <w:noProof/>
+            <w:kern w:val="2"/>
+            <w:sz w:val="24"/>
+            <w:szCs w:val="24"/>
+            <w14:ligatures w14:val="standardContextual"/>
+          </w:rPr>
+          <w:tab/>
+        </w:r>
+        <w:r>
+          <w:rPr>
+            <w:rStyle w:val="Lienhypertexte"/>
+            <w:noProof/>
+          </w:rPr>
+          <w:t>Requête 7</w:t>
+        </w:r>
+        <w:r>
+          <w:rPr>
+            <w:noProof/>
+            <w:webHidden/>
+          </w:rPr>
+          <w:tab/>
+        </w:r>
+        <w:r>
+          <w:rPr>
+            <w:noProof/>
+            <w:webHidden/>
+          </w:rPr>
+          <w:fldChar w:fldCharType="begin"/>
+        </w:r>
+        <w:r>
+          <w:rPr>
+            <w:noProof/>
+            <w:webHidden/>
+          </w:rPr>
+          <w:instrText xml:space="preserve"> PAGEREF _Toc213352340 \h </w:instrText>
+        </w:r>
+        <w:r>
+          <w:rPr>
+            <w:noProof/>
+            <w:webHidden/>
+          </w:rPr>
+        </w:r>
+        <w:r>
+          <w:rPr>
+            <w:noProof/>
+            <w:webHidden/>
+          </w:rPr>
+          <w:fldChar w:fldCharType="separate"/>
+        </w:r>
+        <w:r>
+          <w:rPr>
+            <w:noProof/>
+            <w:webHidden/>
+          </w:rPr>
+          <w:t>24</w:t>
+        </w:r>
+        <w:r>
+          <w:rPr>
+            <w:noProof/>
+            <w:webHidden/>
+          </w:rPr>
+          <w:fldChar w:fldCharType="end"/>
+        </w:r>
+      </w:hyperlink>
+    </w:p>
+    <w:p>
+      <w:pPr>
+        <w:pStyle w:val="TM3"/>
+        <w:tabs>
+          <w:tab w:val="left" w:pos="1200"/>
+          <w:tab w:val="right" w:leader="dot" w:pos="9060"/>
+        </w:tabs>
+        <w:rPr>
+          <w:rFonts w:asciiTheme="minorHAnsi" w:eastAsiaTheme="minorEastAsia" w:hAnsiTheme="minorHAnsi" w:cstheme="minorBidi"/>
+          <w:i w:val="0"/>
+          <w:iCs w:val="0"/>
+          <w:noProof/>
+          <w:kern w:val="2"/>
+          <w:sz w:val="24"/>
+          <w:szCs w:val="24"/>
+          <w14:ligatures w14:val="standardContextual"/>
+        </w:rPr>
+      </w:pPr>
+      <w:hyperlink w:anchor="_Toc213352341" w:history="1">
+        <w:r>
+          <w:rPr>
+            <w:rStyle w:val="Lienhypertexte"/>
+            <w:noProof/>
+          </w:rPr>
+          <w:t>5.3.8</w:t>
+        </w:r>
+        <w:r>
+          <w:rPr>
+            <w:rFonts w:asciiTheme="minorHAnsi" w:eastAsiaTheme="minorEastAsia" w:hAnsiTheme="minorHAnsi" w:cstheme="minorBidi"/>
+            <w:i w:val="0"/>
+            <w:iCs w:val="0"/>
+            <w:noProof/>
+            <w:kern w:val="2"/>
+            <w:sz w:val="24"/>
+            <w:szCs w:val="24"/>
+            <w14:ligatures w14:val="standardContextual"/>
+          </w:rPr>
+          <w:tab/>
+        </w:r>
+        <w:r>
+          <w:rPr>
+            <w:rStyle w:val="Lienhypertexte"/>
+            <w:noProof/>
+          </w:rPr>
+          <w:t>Débrief des requêtes</w:t>
+        </w:r>
+        <w:r>
+          <w:rPr>
+            <w:noProof/>
+            <w:webHidden/>
+          </w:rPr>
+          <w:tab/>
+        </w:r>
+        <w:r>
+          <w:rPr>
+            <w:noProof/>
+            <w:webHidden/>
+          </w:rPr>
+          <w:fldChar w:fldCharType="begin"/>
+        </w:r>
+        <w:r>
+          <w:rPr>
+            <w:noProof/>
+            <w:webHidden/>
+          </w:rPr>
+          <w:instrText xml:space="preserve"> PAGEREF _Toc213352341 \h </w:instrText>
+        </w:r>
+        <w:r>
+          <w:rPr>
+            <w:noProof/>
+            <w:webHidden/>
+          </w:rPr>
+        </w:r>
+        <w:r>
+          <w:rPr>
+            <w:noProof/>
+            <w:webHidden/>
+          </w:rPr>
+          <w:fldChar w:fldCharType="separate"/>
+        </w:r>
+        <w:r>
+          <w:rPr>
+            <w:noProof/>
+            <w:webHidden/>
+          </w:rPr>
+          <w:t>26</w:t>
+        </w:r>
+        <w:r>
+          <w:rPr>
+            <w:noProof/>
+            <w:webHidden/>
+          </w:rPr>
+          <w:fldChar w:fldCharType="end"/>
+        </w:r>
+      </w:hyperlink>
+    </w:p>
+    <w:p>
+      <w:pPr>
+        <w:pStyle w:val="Titre1"/>
+      </w:pPr>
+      <w:r>
+        <w:rPr>
           <w:i/>
           <w:iCs/>
-          <w:caps/>
           <w:sz w:val="22"/>
           <w:szCs w:val="22"/>
         </w:rPr>
+        <w:lastRenderedPageBreak/>
         <w:fldChar w:fldCharType="end"/>
       </w:r>
-      <w:r>
-        <w:br w:type="page"/>
-      </w:r>
-    </w:p>
-    <w:p>
-      <w:pPr>
-        <w:pStyle w:val="Titre1"/>
-      </w:pPr>
       <w:bookmarkStart w:id="0" w:name="_Toc532179955"/>
       <w:bookmarkStart w:id="1" w:name="_Toc165969637"/>
-      <w:bookmarkStart w:id="2" w:name="_Toc212934602"/>
-      <w:r>
-        <w:lastRenderedPageBreak/>
+      <w:bookmarkStart w:id="2" w:name="_Toc213352291"/>
+      <w:r>
         <w:t>Spécifications</w:t>
       </w:r>
       <w:bookmarkEnd w:id="0"/>
@@ -4323,7 +5080,7 @@
       </w:pPr>
       <w:bookmarkStart w:id="3" w:name="_Toc532179969"/>
       <w:bookmarkStart w:id="4" w:name="_Toc165969639"/>
-      <w:bookmarkStart w:id="5" w:name="_Toc212934603"/>
+      <w:bookmarkStart w:id="5" w:name="_Toc213352292"/>
       <w:r>
         <w:t>Introduction</w:t>
       </w:r>
@@ -4366,7 +5123,7 @@
       <w:pPr>
         <w:pStyle w:val="Titre2"/>
       </w:pPr>
-      <w:bookmarkStart w:id="6" w:name="_Toc212934604"/>
+      <w:bookmarkStart w:id="6" w:name="_Toc213352293"/>
       <w:r>
         <w:t>Matériel et logiciels à disposition</w:t>
       </w:r>
@@ -4387,7 +5144,7 @@
       <w:pPr>
         <w:pStyle w:val="Titre2"/>
       </w:pPr>
-      <w:bookmarkStart w:id="7" w:name="_Toc212934605"/>
+      <w:bookmarkStart w:id="7" w:name="_Toc213352294"/>
       <w:r>
         <w:t>Cahier des charges</w:t>
       </w:r>
@@ -4402,7 +5159,7 @@
       <w:pPr>
         <w:pStyle w:val="Titre3"/>
       </w:pPr>
-      <w:bookmarkStart w:id="8" w:name="_Toc212934606"/>
+      <w:bookmarkStart w:id="8" w:name="_Toc213352295"/>
       <w:r>
         <w:t>Fonctionnalités requises (du point de vue de l’utilisateur)</w:t>
       </w:r>
@@ -4436,7 +5193,7 @@
       <w:pPr>
         <w:pStyle w:val="Titre3"/>
       </w:pPr>
-      <w:bookmarkStart w:id="9" w:name="_Toc212934607"/>
+      <w:bookmarkStart w:id="9" w:name="_Toc213352296"/>
       <w:r>
         <w:t>Contraintes</w:t>
       </w:r>
@@ -4462,7 +5219,7 @@
       <w:pPr>
         <w:pStyle w:val="Titre1"/>
       </w:pPr>
-      <w:bookmarkStart w:id="10" w:name="_Toc212934608"/>
+      <w:bookmarkStart w:id="10" w:name="_Toc213352297"/>
       <w:bookmarkEnd w:id="3"/>
       <w:bookmarkEnd w:id="4"/>
       <w:r>
@@ -4476,7 +5233,7 @@
       </w:pPr>
       <w:bookmarkStart w:id="11" w:name="_Toc532179957"/>
       <w:bookmarkStart w:id="12" w:name="_Toc165969641"/>
-      <w:bookmarkStart w:id="13" w:name="_Toc212934609"/>
+      <w:bookmarkStart w:id="13" w:name="_Toc213352298"/>
       <w:r>
         <w:t>Planification</w:t>
       </w:r>
@@ -4555,30 +5312,30 @@
     <w:p/>
     <w:p>
       <w:r>
+        <w:t>Semaine 7 - 8</w:t>
+      </w:r>
+    </w:p>
+    <w:p>
+      <w:r>
+        <w:t xml:space="preserve">Création des </w:t>
+      </w:r>
+      <w:r>
+        <w:t xml:space="preserve">ennemis </w:t>
+      </w:r>
+      <w:r>
+        <w:t>et leur comportement</w:t>
+      </w:r>
+      <w:r>
+        <w:t>.</w:t>
+      </w:r>
+    </w:p>
+    <w:p>
+      <w:pPr>
+        <w:pStyle w:val="Titre2"/>
+      </w:pPr>
+      <w:bookmarkStart w:id="14" w:name="_Toc213352299"/>
+      <w:r>
         <w:lastRenderedPageBreak/>
-        <w:t>Semaine 7 - 8</w:t>
-      </w:r>
-    </w:p>
-    <w:p>
-      <w:r>
-        <w:t xml:space="preserve">Création des </w:t>
-      </w:r>
-      <w:r>
-        <w:t xml:space="preserve">ennemis </w:t>
-      </w:r>
-      <w:r>
-        <w:t>et leur comportement</w:t>
-      </w:r>
-      <w:r>
-        <w:t>.</w:t>
-      </w:r>
-    </w:p>
-    <w:p>
-      <w:pPr>
-        <w:pStyle w:val="Titre2"/>
-      </w:pPr>
-      <w:bookmarkStart w:id="14" w:name="_Toc212934610"/>
-      <w:r>
         <w:t>Analyse fonctionnelle</w:t>
       </w:r>
       <w:bookmarkEnd w:id="14"/>
@@ -4649,7 +5406,7 @@
       <w:pPr>
         <w:pStyle w:val="Titre2"/>
       </w:pPr>
-      <w:bookmarkStart w:id="15" w:name="_Toc212934611"/>
+      <w:bookmarkStart w:id="15" w:name="_Toc213352300"/>
       <w:r>
         <w:t>User stories</w:t>
       </w:r>
@@ -4659,7 +5416,7 @@
       <w:pPr>
         <w:pStyle w:val="Titre3"/>
       </w:pPr>
-      <w:bookmarkStart w:id="16" w:name="_Toc212934612"/>
+      <w:bookmarkStart w:id="16" w:name="_Toc213352301"/>
       <w:r>
         <w:t>Déplacement</w:t>
       </w:r>
@@ -4684,7 +5441,7 @@
       <w:pPr>
         <w:pStyle w:val="Titre3"/>
       </w:pPr>
-      <w:bookmarkStart w:id="17" w:name="_Toc212934613"/>
+      <w:bookmarkStart w:id="17" w:name="_Toc213352302"/>
       <w:r>
         <w:t>Obstacle</w:t>
       </w:r>
@@ -4712,40 +5469,65 @@
       <w:pPr>
         <w:pStyle w:val="Titre3"/>
       </w:pPr>
-      <w:bookmarkStart w:id="18" w:name="_Toc212934614"/>
+      <w:bookmarkStart w:id="18" w:name="_Toc213352303"/>
+      <w:r>
+        <w:t>Point de vie</w:t>
+      </w:r>
+      <w:bookmarkEnd w:id="18"/>
+    </w:p>
+    <w:p>
+      <w:r>
+        <w:t>Le joueur dispose de points de vie, il peut les voir graphiquement, ses points de vie restant, i</w:t>
+      </w:r>
+      <w:r>
+        <w:t xml:space="preserve">ls sont </w:t>
+      </w:r>
+      <w:r>
+        <w:t>affich</w:t>
+      </w:r>
+      <w:r>
+        <w:t>é</w:t>
+      </w:r>
+      <w:r>
+        <w:t xml:space="preserve"> en permanence sur l’écran</w:t>
+      </w:r>
+      <w:r>
+        <w:t>. Il à la capacité de se soigné. Les dégâts reçu par le joueur, par les ennemis ou les obstacles, lui donne un temps d’invincibilité.</w:t>
+      </w:r>
+    </w:p>
+    <w:p>
+      <w:hyperlink r:id="rId15" w:history="1">
+        <w:r>
+          <w:rPr>
+            <w:rStyle w:val="Lienhypertexte"/>
+          </w:rPr>
+          <w:t>https://github.com/Gillian-LHorset/Projet320-ShootEmUp/issues/3</w:t>
+        </w:r>
+      </w:hyperlink>
+    </w:p>
+    <w:p>
+      <w:pPr>
+        <w:pStyle w:val="Titre3"/>
+      </w:pPr>
+      <w:bookmarkStart w:id="19" w:name="_Toc213352304"/>
       <w:r>
         <w:lastRenderedPageBreak/>
-        <w:t>Point de vie</w:t>
-      </w:r>
-      <w:bookmarkEnd w:id="18"/>
-    </w:p>
-    <w:p>
-      <w:r>
-        <w:t>Le joueur dispose de points de vie, il peut les voir graphiquement, ses points de vie restant, i</w:t>
-      </w:r>
-      <w:r>
-        <w:t xml:space="preserve">ls sont </w:t>
-      </w:r>
-      <w:r>
-        <w:t>affich</w:t>
-      </w:r>
-      <w:r>
-        <w:t>é</w:t>
-      </w:r>
-      <w:r>
-        <w:t xml:space="preserve"> en permanence sur l’écran</w:t>
-      </w:r>
-      <w:r>
-        <w:t>. Il à la capacité de se soigné. Les dégâts reçu par le joueur, par les ennemis ou les obstacles, lui donne un temps d’invincibilité.</w:t>
-      </w:r>
-    </w:p>
-    <w:p>
-      <w:hyperlink r:id="rId15" w:history="1">
+        <w:t>Types d’ennemis</w:t>
+      </w:r>
+      <w:bookmarkEnd w:id="19"/>
+    </w:p>
+    <w:p>
+      <w:r>
+        <w:t>Il y a des ennemis qui ont différente caractéristique, de manière générale, les ennemis se déplace de haut en bas, et tir sur le joueur.</w:t>
+      </w:r>
+    </w:p>
+    <w:p>
+      <w:hyperlink r:id="rId16" w:history="1">
         <w:r>
           <w:rPr>
             <w:rStyle w:val="Lienhypertexte"/>
           </w:rPr>
-          <w:t>https://github.com/Gillian-LHorset/Projet320-ShootEmUp/issues/3</w:t>
+          <w:t>https://github.com/Gillian-LHorset/Projet320-ShootEmUp/issues/4</w:t>
         </w:r>
       </w:hyperlink>
     </w:p>
@@ -4753,24 +5535,24 @@
       <w:pPr>
         <w:pStyle w:val="Titre3"/>
       </w:pPr>
-      <w:bookmarkStart w:id="19" w:name="_Toc212934615"/>
-      <w:r>
-        <w:t>Types d’ennemis</w:t>
-      </w:r>
-      <w:bookmarkEnd w:id="19"/>
-    </w:p>
-    <w:p>
-      <w:r>
-        <w:t>Il y a des ennemis qui ont différente caractéristique, de manière générale, les ennemis se déplace de haut en bas, et tir sur le joueur.</w:t>
-      </w:r>
-    </w:p>
-    <w:p>
-      <w:hyperlink r:id="rId16" w:history="1">
+      <w:bookmarkStart w:id="20" w:name="_Toc213352305"/>
+      <w:r>
+        <w:t>Tirs</w:t>
+      </w:r>
+      <w:bookmarkEnd w:id="20"/>
+    </w:p>
+    <w:p>
+      <w:r>
+        <w:t>Les tirs sont une mécanique centrale du jeu, le joueur et les ennemis tirs pour infliger des dégâts. Le joueur doit les éviter pour ne pas perdre de vie et mourir, mais les ennemis ne cherchent pas forcément à les éviter. Il y a un missile qui inflige plus de dégât et qui peut être lâché à la mort des ennemis.</w:t>
+      </w:r>
+    </w:p>
+    <w:p>
+      <w:hyperlink r:id="rId17" w:history="1">
         <w:r>
           <w:rPr>
             <w:rStyle w:val="Lienhypertexte"/>
           </w:rPr>
-          <w:t>https://github.com/Gillian-LHorset/Projet320-ShootEmUp/issues/4</w:t>
+          <w:t>https://github.com/Gillian-LHorset/Projet320-ShootEmUp/issues/5</w:t>
         </w:r>
       </w:hyperlink>
     </w:p>
@@ -4778,24 +5560,39 @@
       <w:pPr>
         <w:pStyle w:val="Titre3"/>
       </w:pPr>
-      <w:bookmarkStart w:id="20" w:name="_Toc212934616"/>
-      <w:r>
-        <w:t>Tirs</w:t>
-      </w:r>
-      <w:bookmarkEnd w:id="20"/>
-    </w:p>
-    <w:p>
-      <w:r>
-        <w:t>Les tirs sont une mécanique centrale du jeu, le joueur et les ennemis tirs pour infliger des dégâts. Le joueur doit les éviter pour ne pas perdre de vie et mourir, mais les ennemis ne cherchent pas forcément à les éviter. Il y a un missile qui inflige plus de dégât et qui peut être lâché à la mort des ennemis.</w:t>
-      </w:r>
-    </w:p>
-    <w:p>
-      <w:hyperlink r:id="rId17" w:history="1">
+      <w:bookmarkStart w:id="21" w:name="_Toc213352306"/>
+      <w:r>
+        <w:t>Système de dégât</w:t>
+      </w:r>
+      <w:bookmarkEnd w:id="21"/>
+    </w:p>
+    <w:p>
+      <w:r>
+        <w:t xml:space="preserve">Les </w:t>
+      </w:r>
+      <w:r>
+        <w:t>dégâts</w:t>
+      </w:r>
+      <w:r>
+        <w:t xml:space="preserve"> font diminuer la vie de l’entité avec laquelle il entre en collision. Ils offrent une </w:t>
+      </w:r>
+      <w:r>
+        <w:t xml:space="preserve">durée d'invulnérabilité de 2 </w:t>
+      </w:r>
+      <w:r>
+        <w:t>secondes</w:t>
+      </w:r>
+      <w:r>
+        <w:t xml:space="preserve"> au joueur après avoir été touché.</w:t>
+      </w:r>
+    </w:p>
+    <w:p>
+      <w:hyperlink r:id="rId18" w:history="1">
         <w:r>
           <w:rPr>
             <w:rStyle w:val="Lienhypertexte"/>
           </w:rPr>
-          <w:t>https://github.com/Gillian-LHorset/Projet320-ShootEmUp/issues/5</w:t>
+          <w:t>https://github.com/Gillian-LHorset/Projet320-ShootEmUp/issues/6</w:t>
         </w:r>
       </w:hyperlink>
     </w:p>
@@ -4803,76 +5600,37 @@
       <w:pPr>
         <w:pStyle w:val="Titre3"/>
       </w:pPr>
-      <w:bookmarkStart w:id="21" w:name="_Toc212934617"/>
-      <w:r>
-        <w:t>Système de dégât</w:t>
-      </w:r>
-      <w:bookmarkEnd w:id="21"/>
-    </w:p>
-    <w:p>
-      <w:r>
-        <w:t xml:space="preserve">Les </w:t>
-      </w:r>
-      <w:r>
-        <w:t>dégâts</w:t>
-      </w:r>
-      <w:r>
-        <w:t xml:space="preserve"> font diminuer la vie de l’entité avec laquelle il entre en collision. Ils offrent une </w:t>
-      </w:r>
-      <w:r>
-        <w:t xml:space="preserve">durée d'invulnérabilité de 2 </w:t>
-      </w:r>
-      <w:r>
-        <w:t>secondes</w:t>
-      </w:r>
-      <w:r>
-        <w:t xml:space="preserve"> au joueur après avoir été touché.</w:t>
-      </w:r>
-    </w:p>
-    <w:p>
-      <w:hyperlink r:id="rId18" w:history="1">
+      <w:bookmarkStart w:id="22" w:name="_Toc213352307"/>
+      <w:r>
+        <w:t>Tir du joueur</w:t>
+      </w:r>
+      <w:bookmarkEnd w:id="22"/>
+    </w:p>
+    <w:p>
+      <w:r>
+        <w:t>Le joueur à la possibilité de tirer avec la barre espac</w:t>
+      </w:r>
+      <w:r>
+        <w:t>e, les tirs ont un cooldown entre eux.</w:t>
+      </w:r>
+    </w:p>
+    <w:p>
+      <w:hyperlink r:id="rId19" w:history="1">
         <w:r>
           <w:rPr>
             <w:rStyle w:val="Lienhypertexte"/>
           </w:rPr>
-          <w:t>https://github.com/Gillian-LHorset/Projet320-ShootEmUp/issues/6</w:t>
+          <w:t>https://github.com/Gillian-LHorset/Projet320-ShootEmUp/issues/7</w:t>
         </w:r>
       </w:hyperlink>
     </w:p>
     <w:p>
       <w:pPr>
-        <w:pStyle w:val="Titre3"/>
-      </w:pPr>
-      <w:bookmarkStart w:id="22" w:name="_Toc212934618"/>
-      <w:r>
-        <w:t>Tir du joueur</w:t>
-      </w:r>
-      <w:bookmarkEnd w:id="22"/>
-    </w:p>
-    <w:p>
-      <w:r>
-        <w:t>Le joueur à la possibilité de tirer avec la barre espac</w:t>
-      </w:r>
-      <w:r>
-        <w:t>e, les tirs ont un cooldown entre eux.</w:t>
-      </w:r>
-    </w:p>
-    <w:p>
-      <w:hyperlink r:id="rId19" w:history="1">
-        <w:r>
-          <w:rPr>
-            <w:rStyle w:val="Lienhypertexte"/>
-          </w:rPr>
-          <w:t>https://github.com/Gillian-LHorset/Projet320-ShootEmUp/issues/7</w:t>
-        </w:r>
-      </w:hyperlink>
-    </w:p>
-    <w:p>
-      <w:pPr>
         <w:pStyle w:val="Titre2"/>
       </w:pPr>
-      <w:bookmarkStart w:id="23" w:name="_Toc212934619"/>
-      <w:r>
+      <w:bookmarkStart w:id="23" w:name="_Toc213352308"/>
+      <w:r>
+        <w:lastRenderedPageBreak/>
         <w:t>Diagramme UML</w:t>
       </w:r>
       <w:bookmarkEnd w:id="23"/>
@@ -4883,10 +5641,10 @@
           <w:noProof/>
         </w:rPr>
         <w:drawing>
-          <wp:inline distT="0" distB="0" distL="0" distR="0" wp14:anchorId="1CD7B606" wp14:editId="5C0E5513">
-            <wp:extent cx="5986732" cy="3775452"/>
-            <wp:effectExtent l="0" t="0" r="0" b="0"/>
-            <wp:docPr id="1333925373" name="Image 1"/>
+          <wp:inline distT="0" distB="0" distL="0" distR="0" wp14:anchorId="3CD6463C" wp14:editId="536A2933">
+            <wp:extent cx="5748655" cy="7577455"/>
+            <wp:effectExtent l="0" t="0" r="4445" b="4445"/>
+            <wp:docPr id="331612487" name="Image 1"/>
             <wp:cNvGraphicFramePr>
               <a:graphicFrameLocks xmlns:a="http://schemas.openxmlformats.org/drawingml/2006/main" noChangeAspect="1"/>
             </wp:cNvGraphicFramePr>
@@ -4900,7 +5658,7 @@
                     </pic:cNvPicPr>
                   </pic:nvPicPr>
                   <pic:blipFill>
-                    <a:blip r:embed="rId20" cstate="print">
+                    <a:blip r:embed="rId20">
                       <a:extLst>
                         <a:ext uri="{28A0092B-C50C-407E-A947-70E740481C1C}">
                           <a14:useLocalDpi xmlns:a14="http://schemas.microsoft.com/office/drawing/2010/main" val="0"/>
@@ -4915,7 +5673,7 @@
                   <pic:spPr bwMode="auto">
                     <a:xfrm>
                       <a:off x="0" y="0"/>
-                      <a:ext cx="6002847" cy="3785615"/>
+                      <a:ext cx="5748655" cy="7577455"/>
                     </a:xfrm>
                     <a:prstGeom prst="rect">
                       <a:avLst/>
@@ -4934,24 +5692,13 @@
     </w:p>
     <w:p>
       <w:r>
-        <w:t>Pour plus de lisibilité, consulter le fichier "</w:t>
-      </w:r>
-      <w:r>
-        <w:t>I-P_POO-gillhorset-DiagrammeUML.png</w:t>
-      </w:r>
-      <w:r>
-        <w:t xml:space="preserve">" fourni dans la </w:t>
-      </w:r>
-      <w:r>
-        <w:t>release</w:t>
-      </w:r>
-      <w:r>
-        <w:t>.</w:t>
-      </w:r>
-    </w:p>
-    <w:p>
-      <w:r>
-        <w:t xml:space="preserve">Ce diagramme indique toutes les variables et méthode utiliser dans </w:t>
+        <w:t>Ce diagramme indique toutes les variables et méthode utilis</w:t>
+      </w:r>
+      <w:r>
+        <w:t>é</w:t>
+      </w:r>
+      <w:r>
+        <w:t xml:space="preserve"> dans </w:t>
       </w:r>
       <w:r>
         <w:t>le</w:t>
@@ -4964,7 +5711,7 @@
       <w:pPr>
         <w:pStyle w:val="Titre3"/>
       </w:pPr>
-      <w:bookmarkStart w:id="24" w:name="_Toc212934620"/>
+      <w:bookmarkStart w:id="24" w:name="_Toc213352309"/>
       <w:r>
         <w:lastRenderedPageBreak/>
         <w:t>Enemy</w:t>
@@ -4973,7 +5720,68 @@
     </w:p>
     <w:p>
       <w:r>
-        <w:t xml:space="preserve">Les différents types d’ennemis hérite de la classe Enemy, cela permet d’avoir des variables et méthode en commun. La classe Enemy contient SniperShoot, qui est utiliser pour </w:t>
+        <w:rPr>
+          <w:noProof/>
+        </w:rPr>
+        <w:drawing>
+          <wp:inline distT="0" distB="0" distL="0" distR="0" wp14:anchorId="1C668ED7" wp14:editId="01726DFC">
+            <wp:extent cx="3649980" cy="3591560"/>
+            <wp:effectExtent l="0" t="0" r="7620" b="8890"/>
+            <wp:docPr id="119885615" name="Image 1"/>
+            <wp:cNvGraphicFramePr>
+              <a:graphicFrameLocks xmlns:a="http://schemas.openxmlformats.org/drawingml/2006/main" noChangeAspect="1"/>
+            </wp:cNvGraphicFramePr>
+            <a:graphic xmlns:a="http://schemas.openxmlformats.org/drawingml/2006/main">
+              <a:graphicData uri="http://schemas.openxmlformats.org/drawingml/2006/picture">
+                <pic:pic xmlns:pic="http://schemas.openxmlformats.org/drawingml/2006/picture">
+                  <pic:nvPicPr>
+                    <pic:cNvPr id="0" name="Picture 2"/>
+                    <pic:cNvPicPr>
+                      <a:picLocks noChangeAspect="1" noChangeArrowheads="1"/>
+                    </pic:cNvPicPr>
+                  </pic:nvPicPr>
+                  <pic:blipFill>
+                    <a:blip r:embed="rId21">
+                      <a:extLst>
+                        <a:ext uri="{28A0092B-C50C-407E-A947-70E740481C1C}">
+                          <a14:useLocalDpi xmlns:a14="http://schemas.microsoft.com/office/drawing/2010/main" val="0"/>
+                        </a:ext>
+                      </a:extLst>
+                    </a:blip>
+                    <a:srcRect/>
+                    <a:stretch>
+                      <a:fillRect/>
+                    </a:stretch>
+                  </pic:blipFill>
+                  <pic:spPr bwMode="auto">
+                    <a:xfrm>
+                      <a:off x="0" y="0"/>
+                      <a:ext cx="3649980" cy="3591560"/>
+                    </a:xfrm>
+                    <a:prstGeom prst="rect">
+                      <a:avLst/>
+                    </a:prstGeom>
+                    <a:noFill/>
+                    <a:ln>
+                      <a:noFill/>
+                    </a:ln>
+                  </pic:spPr>
+                </pic:pic>
+              </a:graphicData>
+            </a:graphic>
+          </wp:inline>
+        </w:drawing>
+      </w:r>
+    </w:p>
+    <w:p>
+      <w:r>
+        <w:t>Les différents types d’ennemis hérite de la classe Enemy, cela permet d’avoir des variables et méthode en commun.</w:t>
+      </w:r>
+      <w:r>
+        <w:t xml:space="preserve"> </w:t>
+      </w:r>
+      <w:r>
+        <w:t xml:space="preserve">La classe Enemy contient SniperShoot, qui est utiliser pour </w:t>
       </w:r>
       <w:r>
         <w:t>les collisions</w:t>
@@ -4990,117 +5798,748 @@
         <w:t>La classe parent contient un Rectangle nommé EnemyRectCollision, il est là pour pouvoir vérifier les collisions avec le joueur ou ses tirs. Elle contient également une méthode de shoot par défaut et des mouvements qui ont pour but d’être override pour que les différentes classes puissent agir différemment. Elle contient des variables DateTime et TimeSpan, qui sont là pour les cooldown des tirs de ennemis.</w:t>
       </w:r>
     </w:p>
+    <w:p>
+      <w:r>
+        <w:rPr>
+          <w:noProof/>
+        </w:rPr>
+        <w:drawing>
+          <wp:inline distT="0" distB="0" distL="0" distR="0" wp14:anchorId="11DBDB45" wp14:editId="67CE6C60">
+            <wp:extent cx="3533217" cy="3423285"/>
+            <wp:effectExtent l="0" t="0" r="0" b="0"/>
+            <wp:docPr id="1035448049" name="Image 3"/>
+            <wp:cNvGraphicFramePr>
+              <a:graphicFrameLocks xmlns:a="http://schemas.openxmlformats.org/drawingml/2006/main" noChangeAspect="1"/>
+            </wp:cNvGraphicFramePr>
+            <a:graphic xmlns:a="http://schemas.openxmlformats.org/drawingml/2006/main">
+              <a:graphicData uri="http://schemas.openxmlformats.org/drawingml/2006/picture">
+                <pic:pic xmlns:pic="http://schemas.openxmlformats.org/drawingml/2006/picture">
+                  <pic:nvPicPr>
+                    <pic:cNvPr id="0" name="Picture 4"/>
+                    <pic:cNvPicPr>
+                      <a:picLocks noChangeAspect="1" noChangeArrowheads="1"/>
+                    </pic:cNvPicPr>
+                  </pic:nvPicPr>
+                  <pic:blipFill rotWithShape="1">
+                    <a:blip r:embed="rId22">
+                      <a:extLst>
+                        <a:ext uri="{28A0092B-C50C-407E-A947-70E740481C1C}">
+                          <a14:useLocalDpi xmlns:a14="http://schemas.microsoft.com/office/drawing/2010/main" val="0"/>
+                        </a:ext>
+                      </a:extLst>
+                    </a:blip>
+                    <a:srcRect l="19768"/>
+                    <a:stretch>
+                      <a:fillRect/>
+                    </a:stretch>
+                  </pic:blipFill>
+                  <pic:spPr bwMode="auto">
+                    <a:xfrm>
+                      <a:off x="0" y="0"/>
+                      <a:ext cx="3533217" cy="3423285"/>
+                    </a:xfrm>
+                    <a:prstGeom prst="rect">
+                      <a:avLst/>
+                    </a:prstGeom>
+                    <a:noFill/>
+                    <a:ln>
+                      <a:noFill/>
+                    </a:ln>
+                    <a:extLst>
+                      <a:ext uri="{53640926-AAD7-44D8-BBD7-CCE9431645EC}">
+                        <a14:shadowObscured xmlns:a14="http://schemas.microsoft.com/office/drawing/2010/main"/>
+                      </a:ext>
+                    </a:extLst>
+                  </pic:spPr>
+                </pic:pic>
+              </a:graphicData>
+            </a:graphic>
+          </wp:inline>
+        </w:drawing>
+      </w:r>
+    </w:p>
+    <w:p>
+      <w:r>
+        <w:t>Le FrontEnemy contient beaucoup de variable pour savoir dans quelle direction bouger.</w:t>
+      </w:r>
+    </w:p>
+    <w:p>
+      <w:r>
+        <w:rPr>
+          <w:noProof/>
+        </w:rPr>
+        <w:lastRenderedPageBreak/>
+        <w:drawing>
+          <wp:inline distT="0" distB="0" distL="0" distR="0" wp14:anchorId="1B9ECB7B" wp14:editId="622EBD7A">
+            <wp:extent cx="4593945" cy="2179955"/>
+            <wp:effectExtent l="0" t="0" r="0" b="0"/>
+            <wp:docPr id="438297309" name="Image 6"/>
+            <wp:cNvGraphicFramePr>
+              <a:graphicFrameLocks xmlns:a="http://schemas.openxmlformats.org/drawingml/2006/main" noChangeAspect="1"/>
+            </wp:cNvGraphicFramePr>
+            <a:graphic xmlns:a="http://schemas.openxmlformats.org/drawingml/2006/main">
+              <a:graphicData uri="http://schemas.openxmlformats.org/drawingml/2006/picture">
+                <pic:pic xmlns:pic="http://schemas.openxmlformats.org/drawingml/2006/picture">
+                  <pic:nvPicPr>
+                    <pic:cNvPr id="0" name="Picture 7"/>
+                    <pic:cNvPicPr>
+                      <a:picLocks noChangeAspect="1" noChangeArrowheads="1"/>
+                    </pic:cNvPicPr>
+                  </pic:nvPicPr>
+                  <pic:blipFill rotWithShape="1">
+                    <a:blip r:embed="rId23">
+                      <a:extLst>
+                        <a:ext uri="{28A0092B-C50C-407E-A947-70E740481C1C}">
+                          <a14:useLocalDpi xmlns:a14="http://schemas.microsoft.com/office/drawing/2010/main" val="0"/>
+                        </a:ext>
+                      </a:extLst>
+                    </a:blip>
+                    <a:srcRect r="20201"/>
+                    <a:stretch>
+                      <a:fillRect/>
+                    </a:stretch>
+                  </pic:blipFill>
+                  <pic:spPr bwMode="auto">
+                    <a:xfrm>
+                      <a:off x="0" y="0"/>
+                      <a:ext cx="4593945" cy="2179955"/>
+                    </a:xfrm>
+                    <a:prstGeom prst="rect">
+                      <a:avLst/>
+                    </a:prstGeom>
+                    <a:noFill/>
+                    <a:ln>
+                      <a:noFill/>
+                    </a:ln>
+                    <a:extLst>
+                      <a:ext uri="{53640926-AAD7-44D8-BBD7-CCE9431645EC}">
+                        <a14:shadowObscured xmlns:a14="http://schemas.microsoft.com/office/drawing/2010/main"/>
+                      </a:ext>
+                    </a:extLst>
+                  </pic:spPr>
+                </pic:pic>
+              </a:graphicData>
+            </a:graphic>
+          </wp:inline>
+        </w:drawing>
+      </w:r>
+    </w:p>
+    <w:p>
+      <w:r>
+        <w:t>BasicEnemy, contient des variables pour savoir quand se déplacer (</w:t>
+      </w:r>
+      <w:r>
+        <w:t>_</w:t>
+      </w:r>
+      <w:r>
+        <w:t>moveTiming)</w:t>
+      </w:r>
+      <w:r>
+        <w:t>, dans quelle direction se déplacer (_moveDirection) et quelle position horizontale être (_rndPositionX).</w:t>
+      </w:r>
+    </w:p>
+    <w:p>
+      <w:r>
+        <w:rPr>
+          <w:noProof/>
+        </w:rPr>
+        <w:drawing>
+          <wp:inline distT="0" distB="0" distL="0" distR="0" wp14:anchorId="347F4289" wp14:editId="00917EE4">
+            <wp:extent cx="4198620" cy="3489351"/>
+            <wp:effectExtent l="0" t="0" r="0" b="0"/>
+            <wp:docPr id="733469534" name="Image 7"/>
+            <wp:cNvGraphicFramePr>
+              <a:graphicFrameLocks xmlns:a="http://schemas.openxmlformats.org/drawingml/2006/main" noChangeAspect="1"/>
+            </wp:cNvGraphicFramePr>
+            <a:graphic xmlns:a="http://schemas.openxmlformats.org/drawingml/2006/main">
+              <a:graphicData uri="http://schemas.openxmlformats.org/drawingml/2006/picture">
+                <pic:pic xmlns:pic="http://schemas.openxmlformats.org/drawingml/2006/picture">
+                  <pic:nvPicPr>
+                    <pic:cNvPr id="0" name="Picture 8"/>
+                    <pic:cNvPicPr>
+                      <a:picLocks noChangeAspect="1" noChangeArrowheads="1"/>
+                    </pic:cNvPicPr>
+                  </pic:nvPicPr>
+                  <pic:blipFill rotWithShape="1">
+                    <a:blip r:embed="rId24">
+                      <a:extLst>
+                        <a:ext uri="{28A0092B-C50C-407E-A947-70E740481C1C}">
+                          <a14:useLocalDpi xmlns:a14="http://schemas.microsoft.com/office/drawing/2010/main" val="0"/>
+                        </a:ext>
+                      </a:extLst>
+                    </a:blip>
+                    <a:srcRect b="18459"/>
+                    <a:stretch>
+                      <a:fillRect/>
+                    </a:stretch>
+                  </pic:blipFill>
+                  <pic:spPr bwMode="auto">
+                    <a:xfrm>
+                      <a:off x="0" y="0"/>
+                      <a:ext cx="4198620" cy="3489351"/>
+                    </a:xfrm>
+                    <a:prstGeom prst="rect">
+                      <a:avLst/>
+                    </a:prstGeom>
+                    <a:noFill/>
+                    <a:ln>
+                      <a:noFill/>
+                    </a:ln>
+                    <a:extLst>
+                      <a:ext uri="{53640926-AAD7-44D8-BBD7-CCE9431645EC}">
+                        <a14:shadowObscured xmlns:a14="http://schemas.microsoft.com/office/drawing/2010/main"/>
+                      </a:ext>
+                    </a:extLst>
+                  </pic:spPr>
+                </pic:pic>
+              </a:graphicData>
+            </a:graphic>
+          </wp:inline>
+        </w:drawing>
+      </w:r>
+    </w:p>
+    <w:p>
+      <w:r>
+        <w:t>SniperEnemy lui a beaucoup de variables pour ses tirs, connaitre leurs taille(_laserHeight), connaitre sa position (_laserYPosition). Il a aussi des variables pour se positionner aléatoirement sur l’axe verticale, savoir quand il est en position (_whenIsInPosition), le temps qu’il lui faut pour tirer après s’être déplacer (_cooldownAfterMove) et savoir s’il est en position pour tirer (_enemyCanShoot).</w:t>
+      </w:r>
+    </w:p>
+    <w:p>
+      <w:r>
+        <w:rPr>
+          <w:noProof/>
+        </w:rPr>
+        <w:drawing>
+          <wp:inline distT="0" distB="0" distL="0" distR="0" wp14:anchorId="71D13E01" wp14:editId="4683539A">
+            <wp:extent cx="3255264" cy="2158264"/>
+            <wp:effectExtent l="0" t="0" r="2540" b="0"/>
+            <wp:docPr id="1659069800" name="Image 5"/>
+            <wp:cNvGraphicFramePr>
+              <a:graphicFrameLocks xmlns:a="http://schemas.openxmlformats.org/drawingml/2006/main" noChangeAspect="1"/>
+            </wp:cNvGraphicFramePr>
+            <a:graphic xmlns:a="http://schemas.openxmlformats.org/drawingml/2006/main">
+              <a:graphicData uri="http://schemas.openxmlformats.org/drawingml/2006/picture">
+                <pic:pic xmlns:pic="http://schemas.openxmlformats.org/drawingml/2006/picture">
+                  <pic:nvPicPr>
+                    <pic:cNvPr id="0" name="Picture 6"/>
+                    <pic:cNvPicPr>
+                      <a:picLocks noChangeAspect="1" noChangeArrowheads="1"/>
+                    </pic:cNvPicPr>
+                  </pic:nvPicPr>
+                  <pic:blipFill rotWithShape="1">
+                    <a:blip r:embed="rId25">
+                      <a:extLst>
+                        <a:ext uri="{28A0092B-C50C-407E-A947-70E740481C1C}">
+                          <a14:useLocalDpi xmlns:a14="http://schemas.microsoft.com/office/drawing/2010/main" val="0"/>
+                        </a:ext>
+                      </a:extLst>
+                    </a:blip>
+                    <a:srcRect t="58034" r="24064"/>
+                    <a:stretch>
+                      <a:fillRect/>
+                    </a:stretch>
+                  </pic:blipFill>
+                  <pic:spPr bwMode="auto">
+                    <a:xfrm>
+                      <a:off x="0" y="0"/>
+                      <a:ext cx="3255264" cy="2158264"/>
+                    </a:xfrm>
+                    <a:prstGeom prst="rect">
+                      <a:avLst/>
+                    </a:prstGeom>
+                    <a:noFill/>
+                    <a:ln>
+                      <a:noFill/>
+                    </a:ln>
+                    <a:extLst>
+                      <a:ext uri="{53640926-AAD7-44D8-BBD7-CCE9431645EC}">
+                        <a14:shadowObscured xmlns:a14="http://schemas.microsoft.com/office/drawing/2010/main"/>
+                      </a:ext>
+                    </a:extLst>
+                  </pic:spPr>
+                </pic:pic>
+              </a:graphicData>
+            </a:graphic>
+          </wp:inline>
+        </w:drawing>
+      </w:r>
+    </w:p>
+    <w:p>
+      <w:r>
+        <w:t>TankEnemy, lui est lié au joueur, il a besoin de sa position pour se déplacer vers sa direction.</w:t>
+      </w:r>
+    </w:p>
+    <w:p>
+      <w:pPr>
+        <w:pStyle w:val="Titre3"/>
+      </w:pPr>
+      <w:bookmarkStart w:id="25" w:name="_Toc213352310"/>
+      <w:r>
+        <w:lastRenderedPageBreak/>
+        <w:t>Shoot</w:t>
+      </w:r>
+      <w:bookmarkEnd w:id="25"/>
+    </w:p>
+    <w:p>
+      <w:r>
+        <w:rPr>
+          <w:noProof/>
+        </w:rPr>
+        <w:drawing>
+          <wp:inline distT="0" distB="0" distL="0" distR="0" wp14:anchorId="67563CC7" wp14:editId="37F319A0">
+            <wp:extent cx="5752465" cy="2402205"/>
+            <wp:effectExtent l="0" t="0" r="635" b="0"/>
+            <wp:docPr id="914181172" name="Image 8"/>
+            <wp:cNvGraphicFramePr>
+              <a:graphicFrameLocks xmlns:a="http://schemas.openxmlformats.org/drawingml/2006/main" noChangeAspect="1"/>
+            </wp:cNvGraphicFramePr>
+            <a:graphic xmlns:a="http://schemas.openxmlformats.org/drawingml/2006/main">
+              <a:graphicData uri="http://schemas.openxmlformats.org/drawingml/2006/picture">
+                <pic:pic xmlns:pic="http://schemas.openxmlformats.org/drawingml/2006/picture">
+                  <pic:nvPicPr>
+                    <pic:cNvPr id="0" name="Picture 9"/>
+                    <pic:cNvPicPr>
+                      <a:picLocks noChangeAspect="1" noChangeArrowheads="1"/>
+                    </pic:cNvPicPr>
+                  </pic:nvPicPr>
+                  <pic:blipFill>
+                    <a:blip r:embed="rId26">
+                      <a:extLst>
+                        <a:ext uri="{28A0092B-C50C-407E-A947-70E740481C1C}">
+                          <a14:useLocalDpi xmlns:a14="http://schemas.microsoft.com/office/drawing/2010/main" val="0"/>
+                        </a:ext>
+                      </a:extLst>
+                    </a:blip>
+                    <a:srcRect/>
+                    <a:stretch>
+                      <a:fillRect/>
+                    </a:stretch>
+                  </pic:blipFill>
+                  <pic:spPr bwMode="auto">
+                    <a:xfrm>
+                      <a:off x="0" y="0"/>
+                      <a:ext cx="5752465" cy="2402205"/>
+                    </a:xfrm>
+                    <a:prstGeom prst="rect">
+                      <a:avLst/>
+                    </a:prstGeom>
+                    <a:noFill/>
+                    <a:ln>
+                      <a:noFill/>
+                    </a:ln>
+                  </pic:spPr>
+                </pic:pic>
+              </a:graphicData>
+            </a:graphic>
+          </wp:inline>
+        </w:drawing>
+      </w:r>
+    </w:p>
+    <w:p>
+      <w:r>
+        <w:t>Shoot possède un rectangle pour vérifier les collisions avec les entités.</w:t>
+      </w:r>
+    </w:p>
+    <w:p>
+      <w:r>
+        <w:t>Missile est une classe qui hérite de Shoot, qui a comme différence sa taille et sa vitesse de mouvement.</w:t>
+      </w:r>
+    </w:p>
+    <w:p>
+      <w:pPr>
+        <w:pStyle w:val="Titre3"/>
+      </w:pPr>
+      <w:bookmarkStart w:id="26" w:name="_Toc213352311"/>
+      <w:r>
+        <w:lastRenderedPageBreak/>
+        <w:t>Ship</w:t>
+      </w:r>
+      <w:bookmarkEnd w:id="26"/>
+    </w:p>
+    <w:p>
+      <w:r>
+        <w:rPr>
+          <w:noProof/>
+        </w:rPr>
+        <w:drawing>
+          <wp:inline distT="0" distB="0" distL="0" distR="0" wp14:anchorId="48D71B15" wp14:editId="3517605F">
+            <wp:extent cx="4210050" cy="8345805"/>
+            <wp:effectExtent l="0" t="0" r="0" b="0"/>
+            <wp:docPr id="1990655448" name="Image 9"/>
+            <wp:cNvGraphicFramePr>
+              <a:graphicFrameLocks xmlns:a="http://schemas.openxmlformats.org/drawingml/2006/main" noChangeAspect="1"/>
+            </wp:cNvGraphicFramePr>
+            <a:graphic xmlns:a="http://schemas.openxmlformats.org/drawingml/2006/main">
+              <a:graphicData uri="http://schemas.openxmlformats.org/drawingml/2006/picture">
+                <pic:pic xmlns:pic="http://schemas.openxmlformats.org/drawingml/2006/picture">
+                  <pic:nvPicPr>
+                    <pic:cNvPr id="0" name="Picture 10"/>
+                    <pic:cNvPicPr>
+                      <a:picLocks noChangeAspect="1" noChangeArrowheads="1"/>
+                    </pic:cNvPicPr>
+                  </pic:nvPicPr>
+                  <pic:blipFill>
+                    <a:blip r:embed="rId27">
+                      <a:extLst>
+                        <a:ext uri="{28A0092B-C50C-407E-A947-70E740481C1C}">
+                          <a14:useLocalDpi xmlns:a14="http://schemas.microsoft.com/office/drawing/2010/main" val="0"/>
+                        </a:ext>
+                      </a:extLst>
+                    </a:blip>
+                    <a:srcRect/>
+                    <a:stretch>
+                      <a:fillRect/>
+                    </a:stretch>
+                  </pic:blipFill>
+                  <pic:spPr bwMode="auto">
+                    <a:xfrm>
+                      <a:off x="0" y="0"/>
+                      <a:ext cx="4210050" cy="8345805"/>
+                    </a:xfrm>
+                    <a:prstGeom prst="rect">
+                      <a:avLst/>
+                    </a:prstGeom>
+                    <a:noFill/>
+                    <a:ln>
+                      <a:noFill/>
+                    </a:ln>
+                  </pic:spPr>
+                </pic:pic>
+              </a:graphicData>
+            </a:graphic>
+          </wp:inline>
+        </w:drawing>
+      </w:r>
+    </w:p>
+    <w:p>
+      <w:r>
+        <w:t xml:space="preserve">Ship est une classe majeure du programme, il contient le vaisseau que le joueur contrôle. Il a des points de vie </w:t>
+      </w:r>
+      <w:r>
+        <w:t xml:space="preserve">(HealPoint), des points de vie maximum (MaxHealPoint) qui est en constant, car elle n’a </w:t>
+      </w:r>
+      <w:r>
+        <w:lastRenderedPageBreak/>
+        <w:t>pas besoin d’être changé. Il à une réserve de missile (ReserveMissile) qui indique combien de missile le joueur peut encore tirer. Il a beaucoup de variable pour savoir quand tirer IsShooting, IsShootingMissile, HaveShoot, _lastBulletShoot, _ShootCooldown, _lastMissileShoot et _missileCooldown</w:t>
+      </w:r>
+      <w:r>
+        <w:t xml:space="preserve"> qui ont un usage spécifique pour chacun. Il a une variable pour savoir si le Joueur est en vie (IsInLife), il a un tableau qui contient </w:t>
+      </w:r>
+      <w:r>
+        <w:t>les différentes hauteurs</w:t>
+      </w:r>
+      <w:r>
+        <w:t xml:space="preserve"> du sol (ShipGround) qui va aller récupérer dans AirSpace pour savoir s’il va toucher le sol, qui est utiliser dans la méthode CheckGroundCollisionPlayer. Il a quelques méthodes </w:t>
+      </w:r>
+      <w:r>
+        <w:t>pour les dégâts reçu, PlayerHitIsNow indique que le joueur vient d’être touché et est utiliser dans PlayerCanBeHit pour savoir si le joueur peut à nouveau être touché.</w:t>
+      </w:r>
+    </w:p>
+    <w:p>
+      <w:pPr>
+        <w:pStyle w:val="Titre3"/>
+      </w:pPr>
+      <w:bookmarkStart w:id="27" w:name="_Toc213352312"/>
+      <w:r>
+        <w:t>AirSpace</w:t>
+      </w:r>
+      <w:bookmarkEnd w:id="27"/>
+    </w:p>
+    <w:p>
+      <w:r>
+        <w:rPr>
+          <w:noProof/>
+        </w:rPr>
+        <w:drawing>
+          <wp:inline distT="0" distB="0" distL="0" distR="0" wp14:anchorId="1F6F22EA" wp14:editId="1F6AF4D6">
+            <wp:extent cx="5404485" cy="6783070"/>
+            <wp:effectExtent l="0" t="0" r="5715" b="0"/>
+            <wp:docPr id="80639787" name="Image 10"/>
+            <wp:cNvGraphicFramePr>
+              <a:graphicFrameLocks xmlns:a="http://schemas.openxmlformats.org/drawingml/2006/main" noChangeAspect="1"/>
+            </wp:cNvGraphicFramePr>
+            <a:graphic xmlns:a="http://schemas.openxmlformats.org/drawingml/2006/main">
+              <a:graphicData uri="http://schemas.openxmlformats.org/drawingml/2006/picture">
+                <pic:pic xmlns:pic="http://schemas.openxmlformats.org/drawingml/2006/picture">
+                  <pic:nvPicPr>
+                    <pic:cNvPr id="0" name="Picture 11"/>
+                    <pic:cNvPicPr>
+                      <a:picLocks noChangeAspect="1" noChangeArrowheads="1"/>
+                    </pic:cNvPicPr>
+                  </pic:nvPicPr>
+                  <pic:blipFill>
+                    <a:blip r:embed="rId28">
+                      <a:extLst>
+                        <a:ext uri="{28A0092B-C50C-407E-A947-70E740481C1C}">
+                          <a14:useLocalDpi xmlns:a14="http://schemas.microsoft.com/office/drawing/2010/main" val="0"/>
+                        </a:ext>
+                      </a:extLst>
+                    </a:blip>
+                    <a:srcRect/>
+                    <a:stretch>
+                      <a:fillRect/>
+                    </a:stretch>
+                  </pic:blipFill>
+                  <pic:spPr bwMode="auto">
+                    <a:xfrm>
+                      <a:off x="0" y="0"/>
+                      <a:ext cx="5404485" cy="6783070"/>
+                    </a:xfrm>
+                    <a:prstGeom prst="rect">
+                      <a:avLst/>
+                    </a:prstGeom>
+                    <a:noFill/>
+                    <a:ln>
+                      <a:noFill/>
+                    </a:ln>
+                  </pic:spPr>
+                </pic:pic>
+              </a:graphicData>
+            </a:graphic>
+          </wp:inline>
+        </w:drawing>
+      </w:r>
+    </w:p>
+    <w:p>
+      <w:r>
+        <w:t xml:space="preserve">La variable _ship est simplement la variable qui contient le joueur. Le tableau ground contiens les hauteurs des différents blocs du sol. Les listes _healItems, _missileItems et _allEnemyList sont simplement des listes pouvant contenir les différents objets qui compose le gameplay du jeu. EnemyDie est utiliser dans les méthodes CheckEnemyCollision et CheckMissileCollision pour </w:t>
+      </w:r>
+      <w:r>
+        <w:lastRenderedPageBreak/>
+        <w:t xml:space="preserve">déterminer si l’ennemi est mort. _timingExplosionPlayer est simplement une variable qui est incrémenter lorsque le joueur meurt pour changer la frame de son animation de mort. Les variables _lastEnemySpawned et _enemySpawnCooldown son utiliser pour déterminer le moment auquel le prochain ennemi va apparaitre et dans combien de temps il va apparaitre. Toutes les méthodes Check… sont utiliser pour vérifier les collisions entre les objets du programme. Les </w:t>
+      </w:r>
+      <w:r>
+        <w:t>méthodes …KeyDown et …KeyUp sont là pour vérifier lorsque le joueur appuie et relâche une touche du clavier.</w:t>
+      </w:r>
+    </w:p>
+    <w:p>
+      <w:pPr>
+        <w:pStyle w:val="Titre3"/>
+      </w:pPr>
+      <w:bookmarkStart w:id="28" w:name="_Toc213352313"/>
+      <w:r>
+        <w:t>Autre</w:t>
+      </w:r>
+      <w:bookmarkEnd w:id="28"/>
+    </w:p>
+    <w:p>
+      <w:r>
+        <w:rPr>
+          <w:noProof/>
+        </w:rPr>
+        <w:drawing>
+          <wp:inline distT="0" distB="0" distL="0" distR="0" wp14:anchorId="317326A0" wp14:editId="27A47B4E">
+            <wp:extent cx="3950970" cy="1555750"/>
+            <wp:effectExtent l="0" t="0" r="0" b="6350"/>
+            <wp:docPr id="290681335" name="Image 11"/>
+            <wp:cNvGraphicFramePr>
+              <a:graphicFrameLocks xmlns:a="http://schemas.openxmlformats.org/drawingml/2006/main" noChangeAspect="1"/>
+            </wp:cNvGraphicFramePr>
+            <a:graphic xmlns:a="http://schemas.openxmlformats.org/drawingml/2006/main">
+              <a:graphicData uri="http://schemas.openxmlformats.org/drawingml/2006/picture">
+                <pic:pic xmlns:pic="http://schemas.openxmlformats.org/drawingml/2006/picture">
+                  <pic:nvPicPr>
+                    <pic:cNvPr id="0" name="Picture 12"/>
+                    <pic:cNvPicPr>
+                      <a:picLocks noChangeAspect="1" noChangeArrowheads="1"/>
+                    </pic:cNvPicPr>
+                  </pic:nvPicPr>
+                  <pic:blipFill>
+                    <a:blip r:embed="rId29">
+                      <a:extLst>
+                        <a:ext uri="{28A0092B-C50C-407E-A947-70E740481C1C}">
+                          <a14:useLocalDpi xmlns:a14="http://schemas.microsoft.com/office/drawing/2010/main" val="0"/>
+                        </a:ext>
+                      </a:extLst>
+                    </a:blip>
+                    <a:srcRect/>
+                    <a:stretch>
+                      <a:fillRect/>
+                    </a:stretch>
+                  </pic:blipFill>
+                  <pic:spPr bwMode="auto">
+                    <a:xfrm>
+                      <a:off x="0" y="0"/>
+                      <a:ext cx="3950970" cy="1555750"/>
+                    </a:xfrm>
+                    <a:prstGeom prst="rect">
+                      <a:avLst/>
+                    </a:prstGeom>
+                    <a:noFill/>
+                    <a:ln>
+                      <a:noFill/>
+                    </a:ln>
+                  </pic:spPr>
+                </pic:pic>
+              </a:graphicData>
+            </a:graphic>
+          </wp:inline>
+        </w:drawing>
+      </w:r>
+    </w:p>
+    <w:p>
+      <w:r>
+        <w:rPr>
+          <w:noProof/>
+        </w:rPr>
+        <w:drawing>
+          <wp:inline distT="0" distB="0" distL="0" distR="0" wp14:anchorId="66B3A1A5" wp14:editId="487E9942">
+            <wp:extent cx="3364230" cy="2306320"/>
+            <wp:effectExtent l="0" t="0" r="0" b="0"/>
+            <wp:docPr id="307550967" name="Image 12"/>
+            <wp:cNvGraphicFramePr>
+              <a:graphicFrameLocks xmlns:a="http://schemas.openxmlformats.org/drawingml/2006/main" noChangeAspect="1"/>
+            </wp:cNvGraphicFramePr>
+            <a:graphic xmlns:a="http://schemas.openxmlformats.org/drawingml/2006/main">
+              <a:graphicData uri="http://schemas.openxmlformats.org/drawingml/2006/picture">
+                <pic:pic xmlns:pic="http://schemas.openxmlformats.org/drawingml/2006/picture">
+                  <pic:nvPicPr>
+                    <pic:cNvPr id="0" name="Picture 13"/>
+                    <pic:cNvPicPr>
+                      <a:picLocks noChangeAspect="1" noChangeArrowheads="1"/>
+                    </pic:cNvPicPr>
+                  </pic:nvPicPr>
+                  <pic:blipFill>
+                    <a:blip r:embed="rId30">
+                      <a:extLst>
+                        <a:ext uri="{28A0092B-C50C-407E-A947-70E740481C1C}">
+                          <a14:useLocalDpi xmlns:a14="http://schemas.microsoft.com/office/drawing/2010/main" val="0"/>
+                        </a:ext>
+                      </a:extLst>
+                    </a:blip>
+                    <a:srcRect/>
+                    <a:stretch>
+                      <a:fillRect/>
+                    </a:stretch>
+                  </pic:blipFill>
+                  <pic:spPr bwMode="auto">
+                    <a:xfrm>
+                      <a:off x="0" y="0"/>
+                      <a:ext cx="3364230" cy="2306320"/>
+                    </a:xfrm>
+                    <a:prstGeom prst="rect">
+                      <a:avLst/>
+                    </a:prstGeom>
+                    <a:noFill/>
+                    <a:ln>
+                      <a:noFill/>
+                    </a:ln>
+                  </pic:spPr>
+                </pic:pic>
+              </a:graphicData>
+            </a:graphic>
+          </wp:inline>
+        </w:drawing>
+      </w:r>
+      <w:r>
+        <w:rPr>
+          <w:noProof/>
+        </w:rPr>
+        <w:drawing>
+          <wp:inline distT="0" distB="0" distL="0" distR="0" wp14:anchorId="7563BF92" wp14:editId="38B5A858">
+            <wp:extent cx="3562350" cy="1125855"/>
+            <wp:effectExtent l="0" t="0" r="0" b="0"/>
+            <wp:docPr id="242776859" name="Image 14"/>
+            <wp:cNvGraphicFramePr>
+              <a:graphicFrameLocks xmlns:a="http://schemas.openxmlformats.org/drawingml/2006/main" noChangeAspect="1"/>
+            </wp:cNvGraphicFramePr>
+            <a:graphic xmlns:a="http://schemas.openxmlformats.org/drawingml/2006/main">
+              <a:graphicData uri="http://schemas.openxmlformats.org/drawingml/2006/picture">
+                <pic:pic xmlns:pic="http://schemas.openxmlformats.org/drawingml/2006/picture">
+                  <pic:nvPicPr>
+                    <pic:cNvPr id="0" name="Picture 15"/>
+                    <pic:cNvPicPr>
+                      <a:picLocks noChangeAspect="1" noChangeArrowheads="1"/>
+                    </pic:cNvPicPr>
+                  </pic:nvPicPr>
+                  <pic:blipFill>
+                    <a:blip r:embed="rId31">
+                      <a:extLst>
+                        <a:ext uri="{28A0092B-C50C-407E-A947-70E740481C1C}">
+                          <a14:useLocalDpi xmlns:a14="http://schemas.microsoft.com/office/drawing/2010/main" val="0"/>
+                        </a:ext>
+                      </a:extLst>
+                    </a:blip>
+                    <a:srcRect/>
+                    <a:stretch>
+                      <a:fillRect/>
+                    </a:stretch>
+                  </pic:blipFill>
+                  <pic:spPr bwMode="auto">
+                    <a:xfrm>
+                      <a:off x="0" y="0"/>
+                      <a:ext cx="3562350" cy="1125855"/>
+                    </a:xfrm>
+                    <a:prstGeom prst="rect">
+                      <a:avLst/>
+                    </a:prstGeom>
+                    <a:noFill/>
+                    <a:ln>
+                      <a:noFill/>
+                    </a:ln>
+                  </pic:spPr>
+                </pic:pic>
+              </a:graphicData>
+            </a:graphic>
+          </wp:inline>
+        </w:drawing>
+      </w:r>
+    </w:p>
+    <w:p>
+      <w:r>
+        <w:rPr>
+          <w:noProof/>
+        </w:rPr>
+        <w:drawing>
+          <wp:inline distT="0" distB="0" distL="0" distR="0" wp14:anchorId="4ECBC3F2" wp14:editId="452C5747">
+            <wp:extent cx="2599690" cy="1951355"/>
+            <wp:effectExtent l="0" t="0" r="0" b="0"/>
+            <wp:docPr id="685514403" name="Image 13"/>
+            <wp:cNvGraphicFramePr>
+              <a:graphicFrameLocks xmlns:a="http://schemas.openxmlformats.org/drawingml/2006/main" noChangeAspect="1"/>
+            </wp:cNvGraphicFramePr>
+            <a:graphic xmlns:a="http://schemas.openxmlformats.org/drawingml/2006/main">
+              <a:graphicData uri="http://schemas.openxmlformats.org/drawingml/2006/picture">
+                <pic:pic xmlns:pic="http://schemas.openxmlformats.org/drawingml/2006/picture">
+                  <pic:nvPicPr>
+                    <pic:cNvPr id="0" name="Picture 14"/>
+                    <pic:cNvPicPr>
+                      <a:picLocks noChangeAspect="1" noChangeArrowheads="1"/>
+                    </pic:cNvPicPr>
+                  </pic:nvPicPr>
+                  <pic:blipFill>
+                    <a:blip r:embed="rId32">
+                      <a:extLst>
+                        <a:ext uri="{28A0092B-C50C-407E-A947-70E740481C1C}">
+                          <a14:useLocalDpi xmlns:a14="http://schemas.microsoft.com/office/drawing/2010/main" val="0"/>
+                        </a:ext>
+                      </a:extLst>
+                    </a:blip>
+                    <a:srcRect/>
+                    <a:stretch>
+                      <a:fillRect/>
+                    </a:stretch>
+                  </pic:blipFill>
+                  <pic:spPr bwMode="auto">
+                    <a:xfrm>
+                      <a:off x="0" y="0"/>
+                      <a:ext cx="2599690" cy="1951355"/>
+                    </a:xfrm>
+                    <a:prstGeom prst="rect">
+                      <a:avLst/>
+                    </a:prstGeom>
+                    <a:noFill/>
+                    <a:ln>
+                      <a:noFill/>
+                    </a:ln>
+                  </pic:spPr>
+                </pic:pic>
+              </a:graphicData>
+            </a:graphic>
+          </wp:inline>
+        </w:drawing>
+      </w:r>
+    </w:p>
     <w:p/>
-    <w:p>
-      <w:r>
-        <w:t>Le FrontEnemy contient beaucoup de variable pour savoir dans quelle direction bouger.</w:t>
-      </w:r>
-    </w:p>
-    <w:p/>
-    <w:p>
-      <w:r>
-        <w:t>BasicEnemy, contient des variables pour savoir quand se déplacer (</w:t>
-      </w:r>
-      <w:r>
-        <w:t>_</w:t>
-      </w:r>
-      <w:r>
-        <w:t>moveTiming)</w:t>
-      </w:r>
-      <w:r>
-        <w:t>, dans quelle direction se déplacer (_moveDirection) et quelle position horizontale être (_rndPositionX).</w:t>
-      </w:r>
-    </w:p>
-    <w:p/>
-    <w:p>
-      <w:r>
-        <w:t>SniperEnemy lui a beaucoup de variables pour ses tirs, connaitre leurs taille(_laserHeight), connaitre sa position (_laserYPosition). Il a aussi des variables pour se positionner aléatoirement sur l’axe verticale, savoir quand il est en position (_whenIsInPosition), le temps qu’il lui faut pour tirer après s’être déplacer (_cooldownAfterMove) et savoir s’il est en position pour tirer (_enemyCanShoot).</w:t>
-      </w:r>
-    </w:p>
-    <w:p/>
-    <w:p>
-      <w:r>
-        <w:t>TankEnemy, lui est lié au joueur, il a besoin de sa position pour se déplacer vers sa direction.</w:t>
-      </w:r>
-    </w:p>
-    <w:p>
-      <w:pPr>
-        <w:pStyle w:val="Titre3"/>
-      </w:pPr>
-      <w:bookmarkStart w:id="25" w:name="_Toc212934621"/>
-      <w:r>
-        <w:t>Shoot</w:t>
-      </w:r>
-      <w:bookmarkEnd w:id="25"/>
-    </w:p>
-    <w:p>
-      <w:r>
-        <w:t>Shoot possède un rectangle pour vérifier les collisions avec les entités.</w:t>
-      </w:r>
-    </w:p>
-    <w:p>
-      <w:r>
-        <w:t>Missile est une classe qui hérite de Shoot, qui a comme différence sa taille et sa vitesse de mouvement.</w:t>
-      </w:r>
-    </w:p>
-    <w:p>
-      <w:pPr>
-        <w:pStyle w:val="Titre3"/>
-      </w:pPr>
-      <w:bookmarkStart w:id="26" w:name="_Toc212934622"/>
-      <w:r>
-        <w:t>Ship</w:t>
-      </w:r>
-      <w:bookmarkEnd w:id="26"/>
-    </w:p>
-    <w:p>
-      <w:r>
-        <w:t xml:space="preserve">Ship est une classe majeure du programme, il contient le vaisseau que le joueur contrôle. Il a des points de vie </w:t>
-      </w:r>
-      <w:r>
-        <w:t>(HealPoint), des points de vie maximum (MaxHealPoint) qui est en constant, car elle n’a pas besoin d’être changé. Il à une réserve de missile (ReserveMissile) qui indique combien de missile le joueur peut encore tirer. Il a beaucoup de variable pour savoir quand tirer IsShooting, IsShootingMissile, HaveShoot, _lastBulletShoot, _ShootCooldown, _lastMissileShoot et _missileCooldown</w:t>
-      </w:r>
-      <w:r>
-        <w:t xml:space="preserve"> qui ont un usage spécifique pour chacun. Il a une variable pour savoir si le Joueur est en vie (IsInLife), il a un tableau qui contient </w:t>
-      </w:r>
-      <w:r>
-        <w:t>les différentes hauteurs</w:t>
-      </w:r>
-      <w:r>
-        <w:t xml:space="preserve"> du sol (ShipGround) qui va aller récupérer dans AirSpace pour savoir s’il va toucher le sol, qui est utiliser dans la méthode CheckGroundCollisionPlayer. Il a quelques méthodes </w:t>
-      </w:r>
-      <w:r>
-        <w:t>pour les dégâts reçu, PlayerHitIsNow indique que le joueur vient d’être touché et est utiliser dans PlayerCanBeHit pour savoir si le joueur peut à nouveau être touché.</w:t>
-      </w:r>
-    </w:p>
-    <w:p>
-      <w:pPr>
-        <w:pStyle w:val="Titre3"/>
-      </w:pPr>
-      <w:bookmarkStart w:id="27" w:name="_Toc212934623"/>
-      <w:r>
-        <w:t>AirSpace</w:t>
-      </w:r>
-      <w:bookmarkEnd w:id="27"/>
-    </w:p>
-    <w:p>
-      <w:r>
-        <w:t xml:space="preserve">La variable _ship est simplement la variable qui contient le joueur. Le tableau ground contiens les hauteurs des différents blocs du sol. Les listes _healItems, _missileItems et _allEnemyList sont simplement des listes pouvant contenir les différents objets qui compose le gameplay du jeu. EnemyDie est utiliser dans les méthodes CheckEnemyCollision et CheckMissileCollision pour déterminer si l’ennemi est mort. _timingExplosionPlayer est simplement une variable qui est incrémenter lorsque le joueur meurt pour changer la frame de son animation de mort. Les variables _lastEnemySpawned et _enemySpawnCooldown son utiliser pour déterminer le moment auquel le prochain ennemi va apparaitre et dans combien de temps il va apparaitre. Toutes les méthodes Check… sont utiliser pour vérifier les collisions entre les objets du programme. Les </w:t>
-      </w:r>
-      <w:r>
-        <w:t>méthodes …KeyDown et …KeyUp sont là pour vérifier lorsque le joueur appuie et relâche une touche du clavier.</w:t>
-      </w:r>
-    </w:p>
-    <w:p>
-      <w:pPr>
-        <w:pStyle w:val="Titre3"/>
-      </w:pPr>
-      <w:bookmarkStart w:id="28" w:name="_Toc212934624"/>
-      <w:r>
-        <w:t>Autre</w:t>
-      </w:r>
-      <w:bookmarkEnd w:id="28"/>
-    </w:p>
     <w:p>
       <w:r>
         <w:t>La plupart des classes possède des méthodes Render, elles servent simplement à s’afficher sur l’écran. Certaines possède des variables …RectCollision, elles sont là pour être utiliser pour vérifier quand deux objets se touche.</w:t>
@@ -5112,7 +6551,7 @@
       </w:pPr>
       <w:bookmarkStart w:id="29" w:name="_Toc532179964"/>
       <w:bookmarkStart w:id="30" w:name="_Toc165969648"/>
-      <w:bookmarkStart w:id="31" w:name="_Toc212934625"/>
+      <w:bookmarkStart w:id="31" w:name="_Toc213352314"/>
       <w:bookmarkEnd w:id="11"/>
       <w:bookmarkEnd w:id="12"/>
       <w:r>
@@ -5129,7 +6568,7 @@
       </w:pPr>
       <w:bookmarkStart w:id="32" w:name="_Toc532179965"/>
       <w:bookmarkStart w:id="33" w:name="_Toc165969649"/>
-      <w:bookmarkStart w:id="34" w:name="_Toc212934626"/>
+      <w:bookmarkStart w:id="34" w:name="_Toc213352315"/>
       <w:r>
         <w:t>Dossier de Réalisation</w:t>
       </w:r>
@@ -5154,7 +6593,7 @@
       <w:pPr>
         <w:pStyle w:val="Titre3"/>
       </w:pPr>
-      <w:bookmarkStart w:id="35" w:name="_Toc212934627"/>
+      <w:bookmarkStart w:id="35" w:name="_Toc213352316"/>
       <w:r>
         <w:t>Gameplay</w:t>
       </w:r>
@@ -5183,7 +6622,7 @@
       <w:pPr>
         <w:pStyle w:val="Titre3"/>
       </w:pPr>
-      <w:bookmarkStart w:id="36" w:name="_Toc212934628"/>
+      <w:bookmarkStart w:id="36" w:name="_Toc213352317"/>
       <w:r>
         <w:t>Le joueur</w:t>
       </w:r>
@@ -5207,7 +6646,7 @@
       <w:pPr>
         <w:pStyle w:val="Titre3"/>
       </w:pPr>
-      <w:bookmarkStart w:id="37" w:name="_Toc212934629"/>
+      <w:bookmarkStart w:id="37" w:name="_Toc213352318"/>
       <w:r>
         <w:t>Tirs</w:t>
       </w:r>
@@ -5282,7 +6721,7 @@
       <w:pPr>
         <w:pStyle w:val="Titre3"/>
       </w:pPr>
-      <w:bookmarkStart w:id="38" w:name="_Toc212934630"/>
+      <w:bookmarkStart w:id="38" w:name="_Toc213352319"/>
       <w:r>
         <w:t>Ennemis</w:t>
       </w:r>
@@ -5386,16 +6825,19 @@
       <w:pPr>
         <w:pStyle w:val="Titre3"/>
       </w:pPr>
-      <w:bookmarkStart w:id="39" w:name="_Toc212934631"/>
+      <w:bookmarkStart w:id="39" w:name="_Toc213352320"/>
+      <w:r>
+        <w:t>Points de vie</w:t>
+      </w:r>
+      <w:bookmarkEnd w:id="39"/>
+    </w:p>
+    <w:p>
+      <w:r>
+        <w:t xml:space="preserve">Chaque entité, que se soit joueur ou ennemi, possède des points de vie. Ces points de vie diminuent, sauf exception, au contacte des projectiles. Alors que les tirs basiques font un point de dégât, les </w:t>
+      </w:r>
       <w:r>
         <w:lastRenderedPageBreak/>
-        <w:t>Points de vie</w:t>
-      </w:r>
-      <w:bookmarkEnd w:id="39"/>
-    </w:p>
-    <w:p>
-      <w:r>
-        <w:t>Chaque entité, que se soit joueur ou ennemi, possède des points de vie. Ces points de vie diminuent, sauf exception, au contacte des projectiles. Alors que les tirs basiques font un point de dégât, les missiles en font trois. Le joueur à la possibilité de se soigner en récupérant des objets de soin qui peuvent être lâché par les ennemis à leur mort.</w:t>
+        <w:t>missiles en font trois. Le joueur à la possibilité de se soigner en récupérant des objets de soin qui peuvent être lâché par les ennemis à leur mort.</w:t>
       </w:r>
     </w:p>
     <w:p>
@@ -5422,7 +6864,7 @@
       <w:pPr>
         <w:pStyle w:val="Titre2"/>
       </w:pPr>
-      <w:bookmarkStart w:id="40" w:name="_Toc212934632"/>
+      <w:bookmarkStart w:id="40" w:name="_Toc213352321"/>
       <w:r>
         <w:t>Réalisation technique</w:t>
       </w:r>
@@ -5437,7 +6879,7 @@
       <w:pPr>
         <w:pStyle w:val="Titre3"/>
       </w:pPr>
-      <w:bookmarkStart w:id="41" w:name="_Toc212934633"/>
+      <w:bookmarkStart w:id="41" w:name="_Toc213352322"/>
       <w:r>
         <w:t>Ship</w:t>
       </w:r>
@@ -5489,7 +6931,7 @@
       <w:pPr>
         <w:pStyle w:val="Titre3"/>
       </w:pPr>
-      <w:bookmarkStart w:id="42" w:name="_Toc212934634"/>
+      <w:bookmarkStart w:id="42" w:name="_Toc213352323"/>
       <w:r>
         <w:t>Ennemis</w:t>
       </w:r>
@@ -5556,7 +6998,7 @@
       <w:pPr>
         <w:pStyle w:val="Titre3"/>
       </w:pPr>
-      <w:bookmarkStart w:id="43" w:name="_Toc212934635"/>
+      <w:bookmarkStart w:id="43" w:name="_Toc213352324"/>
       <w:r>
         <w:t>Shoot</w:t>
       </w:r>
@@ -5579,30 +7021,33 @@
       <w:pPr>
         <w:pStyle w:val="Titre3"/>
       </w:pPr>
-      <w:bookmarkStart w:id="44" w:name="_Toc212934636"/>
+      <w:bookmarkStart w:id="44" w:name="_Toc213352325"/>
+      <w:r>
+        <w:t>AirSpace</w:t>
+      </w:r>
+      <w:bookmarkEnd w:id="44"/>
+    </w:p>
+    <w:p>
+      <w:r>
+        <w:t xml:space="preserve">Le AirSpace contient, à peu près, toutes les listes et objets du jeu. </w:t>
+      </w:r>
+    </w:p>
+    <w:p>
+      <w:r>
+        <w:t xml:space="preserve">Il contient les listes des items, des ennemis, la liste des tirs ennemis et le joueur. Cela est fait pour pouvoir créer très simplement des méthodes en utilisant </w:t>
+      </w:r>
+      <w:r>
+        <w:t>les objets présents</w:t>
+      </w:r>
+      <w:r>
+        <w:t xml:space="preserve"> de dedans</w:t>
+      </w:r>
+      <w:r>
+        <w:t xml:space="preserve">. La grande </w:t>
+      </w:r>
       <w:r>
         <w:lastRenderedPageBreak/>
-        <w:t>AirSpace</w:t>
-      </w:r>
-      <w:bookmarkEnd w:id="44"/>
-    </w:p>
-    <w:p>
-      <w:r>
-        <w:t xml:space="preserve">Le AirSpace contient, à peu près, toutes les listes et objets du jeu. </w:t>
-      </w:r>
-    </w:p>
-    <w:p>
-      <w:r>
-        <w:t xml:space="preserve">Il contient les listes des items, des ennemis, la liste des tirs ennemis et le joueur. Cela est fait pour pouvoir créer très simplement des méthodes en utilisant </w:t>
-      </w:r>
-      <w:r>
-        <w:t>les objets présents</w:t>
-      </w:r>
-      <w:r>
-        <w:t xml:space="preserve"> de dedans</w:t>
-      </w:r>
-      <w:r>
-        <w:t>. La grande majorité des méthodes de check de collision sont présente dedans, comme il contient déjà toutes les listes cela rends le tout beaucoup plus facile.</w:t>
+        <w:t>majorité des méthodes de check de collision sont présente dedans, comme il contient déjà toutes les listes cela rends le tout beaucoup plus facile.</w:t>
       </w:r>
     </w:p>
     <w:p/>
@@ -5612,7 +7057,7 @@
         <w:pStyle w:val="Titre1"/>
       </w:pPr>
       <w:bookmarkStart w:id="45" w:name="_Toc165969653"/>
-      <w:bookmarkStart w:id="46" w:name="_Toc212934637"/>
+      <w:bookmarkStart w:id="46" w:name="_Toc213352326"/>
       <w:r>
         <w:t>Conclusion</w:t>
       </w:r>
@@ -5624,7 +7069,7 @@
         <w:pStyle w:val="Titre2"/>
       </w:pPr>
       <w:bookmarkStart w:id="47" w:name="_Toc165969654"/>
-      <w:bookmarkStart w:id="48" w:name="_Toc212934638"/>
+      <w:bookmarkStart w:id="48" w:name="_Toc213352327"/>
       <w:r>
         <w:t xml:space="preserve">Bilan des </w:t>
       </w:r>
@@ -5647,7 +7092,7 @@
         <w:pStyle w:val="Titre2"/>
       </w:pPr>
       <w:bookmarkStart w:id="49" w:name="_Toc165969655"/>
-      <w:bookmarkStart w:id="50" w:name="_Toc212934639"/>
+      <w:bookmarkStart w:id="50" w:name="_Toc213352328"/>
       <w:r>
         <w:t>Bilan de la planification</w:t>
       </w:r>
@@ -5715,10 +7160,7 @@
         <w:t xml:space="preserve"> </w:t>
       </w:r>
       <w:r>
-        <w:t>créer le système de t</w:t>
-      </w:r>
-      <w:r>
-        <w:t>irs</w:t>
+        <w:t>créer le système de tirs</w:t>
       </w:r>
       <w:r>
         <w:t xml:space="preserve">, créer un système de </w:t>
@@ -5753,7 +7195,7 @@
         <w:pStyle w:val="Titre2"/>
       </w:pPr>
       <w:bookmarkStart w:id="51" w:name="_Toc165969656"/>
-      <w:bookmarkStart w:id="52" w:name="_Toc212934640"/>
+      <w:bookmarkStart w:id="52" w:name="_Toc213352329"/>
       <w:r>
         <w:t>Bilan personnel</w:t>
       </w:r>
@@ -5771,7 +7213,7 @@
       </w:pPr>
       <w:bookmarkStart w:id="53" w:name="_Toc532179971"/>
       <w:bookmarkStart w:id="54" w:name="_Toc165969657"/>
-      <w:bookmarkStart w:id="55" w:name="_Toc212934641"/>
+      <w:bookmarkStart w:id="55" w:name="_Toc213352330"/>
       <w:r>
         <w:t>Divers</w:t>
       </w:r>
@@ -5785,7 +7227,7 @@
       </w:pPr>
       <w:bookmarkStart w:id="56" w:name="_Toc532179972"/>
       <w:bookmarkStart w:id="57" w:name="_Toc165969658"/>
-      <w:bookmarkStart w:id="58" w:name="_Toc212934642"/>
+      <w:bookmarkStart w:id="58" w:name="_Toc213352331"/>
       <w:r>
         <w:t>Journal de travail</w:t>
       </w:r>
@@ -5808,7 +7250,7 @@
       <w:pPr>
         <w:pStyle w:val="Titre2"/>
       </w:pPr>
-      <w:bookmarkStart w:id="59" w:name="_Toc212934643"/>
+      <w:bookmarkStart w:id="59" w:name="_Toc213352332"/>
       <w:r>
         <w:t>Webographie</w:t>
       </w:r>
@@ -5864,7 +7306,7 @@
           <w:lang w:val="en-US"/>
         </w:rPr>
       </w:pPr>
-      <w:hyperlink r:id="rId21" w:history="1">
+      <w:hyperlink r:id="rId33" w:history="1">
         <w:r>
           <w:rPr>
             <w:rStyle w:val="Lienhypertexte"/>
@@ -5875,7 +7317,7 @@
       </w:hyperlink>
     </w:p>
     <w:p>
-      <w:hyperlink r:id="rId22" w:history="1">
+      <w:hyperlink r:id="rId34" w:history="1">
         <w:r>
           <w:rPr>
             <w:rStyle w:val="Lienhypertexte"/>
@@ -5886,31 +7328,715 @@
     </w:p>
     <w:p/>
     <w:p>
-      <w:pPr>
-        <w:pStyle w:val="Titre1"/>
-      </w:pPr>
-      <w:bookmarkStart w:id="60" w:name="_Toc212934644"/>
-      <w:r>
-        <w:t>Annexes</w:t>
+      <w:r>
+        <w:t>L’IA utilisé durant le projet était Le Chat (</w:t>
+      </w:r>
+      <w:hyperlink r:id="rId35" w:history="1">
+        <w:r>
+          <w:rPr>
+            <w:rStyle w:val="Lienhypertexte"/>
+          </w:rPr>
+          <w:t>https://chat.mistral.ai</w:t>
+        </w:r>
+      </w:hyperlink>
+      <w:r>
+        <w:t>).</w:t>
+      </w:r>
+    </w:p>
+    <w:p>
+      <w:pPr>
+        <w:pStyle w:val="Titre2"/>
+      </w:pPr>
+      <w:bookmarkStart w:id="60" w:name="_Toc213352333"/>
+      <w:r>
+        <w:t>Utilisation de l’IA</w:t>
       </w:r>
       <w:bookmarkEnd w:id="60"/>
     </w:p>
     <w:p>
       <w:r>
-        <w:t>Pour le diagramme UML voir le fichier "</w:t>
-      </w:r>
-      <w:r>
-        <w:t>I-P_POO-gillhorset-DiagrammeUML.png</w:t>
-      </w:r>
-      <w:r>
-        <w:t>"</w:t>
+        <w:t xml:space="preserve">Durant le projet, j’ai eu recoure à l’utilisation de l’IA à but informatif. Ayant de </w:t>
+      </w:r>
+      <w:r>
+        <w:t>grande difficulté</w:t>
+      </w:r>
+      <w:r>
+        <w:t xml:space="preserve"> et dans le but de gagner du temps sans avoir besoin de passer par des forums et </w:t>
+      </w:r>
+      <w:r>
+        <w:t>la documentation officielle. L’utilisation de l’IA n’a pas été abusive, je suis en capacité de reproduire le code et d’expliquer chaque ligne.</w:t>
+      </w:r>
+    </w:p>
+    <w:p>
+      <w:r>
+        <w:t>Promptes envoyé à l’IA :</w:t>
+      </w:r>
+    </w:p>
+    <w:p>
+      <w:pPr>
+        <w:pStyle w:val="Titre3"/>
+      </w:pPr>
+      <w:bookmarkStart w:id="61" w:name="_Toc213352334"/>
+      <w:r>
+        <w:lastRenderedPageBreak/>
+        <w:t>Requête 1</w:t>
+      </w:r>
+      <w:bookmarkEnd w:id="61"/>
+    </w:p>
+    <w:p>
+      <w:r>
+        <w:rPr>
+          <w:noProof/>
+        </w:rPr>
+        <w:drawing>
+          <wp:inline distT="0" distB="0" distL="0" distR="0" wp14:anchorId="7D01EA90" wp14:editId="2CB7C5F2">
+            <wp:extent cx="5759450" cy="5737225"/>
+            <wp:effectExtent l="0" t="0" r="0" b="0"/>
+            <wp:docPr id="769104312" name="Image 1" descr="Une image contenant texte, capture d’écran, logiciel, ordinateur&#10;&#10;Le contenu généré par l’IA peut être incorrect."/>
+            <wp:cNvGraphicFramePr>
+              <a:graphicFrameLocks xmlns:a="http://schemas.openxmlformats.org/drawingml/2006/main" noChangeAspect="1"/>
+            </wp:cNvGraphicFramePr>
+            <a:graphic xmlns:a="http://schemas.openxmlformats.org/drawingml/2006/main">
+              <a:graphicData uri="http://schemas.openxmlformats.org/drawingml/2006/picture">
+                <pic:pic xmlns:pic="http://schemas.openxmlformats.org/drawingml/2006/picture">
+                  <pic:nvPicPr>
+                    <pic:cNvPr id="769104312" name="Image 1" descr="Une image contenant texte, capture d’écran, logiciel, ordinateur&#10;&#10;Le contenu généré par l’IA peut être incorrect."/>
+                    <pic:cNvPicPr/>
+                  </pic:nvPicPr>
+                  <pic:blipFill>
+                    <a:blip r:embed="rId36"/>
+                    <a:stretch>
+                      <a:fillRect/>
+                    </a:stretch>
+                  </pic:blipFill>
+                  <pic:spPr>
+                    <a:xfrm>
+                      <a:off x="0" y="0"/>
+                      <a:ext cx="5759450" cy="5737225"/>
+                    </a:xfrm>
+                    <a:prstGeom prst="rect">
+                      <a:avLst/>
+                    </a:prstGeom>
+                  </pic:spPr>
+                </pic:pic>
+              </a:graphicData>
+            </a:graphic>
+          </wp:inline>
+        </w:drawing>
+      </w:r>
+    </w:p>
+    <w:p>
+      <w:r>
+        <w:t>Réponse de l’IA :</w:t>
+      </w:r>
+    </w:p>
+    <w:p>
+      <w:r>
+        <w:rPr>
+          <w:noProof/>
+        </w:rPr>
+        <w:drawing>
+          <wp:inline distT="0" distB="0" distL="0" distR="0" wp14:anchorId="5A6C49C4" wp14:editId="0A95789C">
+            <wp:extent cx="5759450" cy="2526665"/>
+            <wp:effectExtent l="0" t="0" r="0" b="6985"/>
+            <wp:docPr id="1896901397" name="Image 1" descr="Une image contenant texte, capture d’écran, Police, logiciel&#10;&#10;Le contenu généré par l’IA peut être incorrect."/>
+            <wp:cNvGraphicFramePr>
+              <a:graphicFrameLocks xmlns:a="http://schemas.openxmlformats.org/drawingml/2006/main" noChangeAspect="1"/>
+            </wp:cNvGraphicFramePr>
+            <a:graphic xmlns:a="http://schemas.openxmlformats.org/drawingml/2006/main">
+              <a:graphicData uri="http://schemas.openxmlformats.org/drawingml/2006/picture">
+                <pic:pic xmlns:pic="http://schemas.openxmlformats.org/drawingml/2006/picture">
+                  <pic:nvPicPr>
+                    <pic:cNvPr id="1896901397" name="Image 1" descr="Une image contenant texte, capture d’écran, Police, logiciel&#10;&#10;Le contenu généré par l’IA peut être incorrect."/>
+                    <pic:cNvPicPr/>
+                  </pic:nvPicPr>
+                  <pic:blipFill>
+                    <a:blip r:embed="rId37"/>
+                    <a:stretch>
+                      <a:fillRect/>
+                    </a:stretch>
+                  </pic:blipFill>
+                  <pic:spPr>
+                    <a:xfrm>
+                      <a:off x="0" y="0"/>
+                      <a:ext cx="5759450" cy="2526665"/>
+                    </a:xfrm>
+                    <a:prstGeom prst="rect">
+                      <a:avLst/>
+                    </a:prstGeom>
+                  </pic:spPr>
+                </pic:pic>
+              </a:graphicData>
+            </a:graphic>
+          </wp:inline>
+        </w:drawing>
+      </w:r>
+    </w:p>
+    <w:p>
+      <w:r>
+        <w:rPr>
+          <w:noProof/>
+        </w:rPr>
+        <w:lastRenderedPageBreak/>
+        <w:drawing>
+          <wp:inline distT="0" distB="0" distL="0" distR="0" wp14:anchorId="4B29107B" wp14:editId="6355EE9E">
+            <wp:extent cx="5759450" cy="5751830"/>
+            <wp:effectExtent l="0" t="0" r="0" b="1270"/>
+            <wp:docPr id="1415425614" name="Image 1" descr="Une image contenant texte, capture d’écran, logiciel, affichage&#10;&#10;Le contenu généré par l’IA peut être incorrect."/>
+            <wp:cNvGraphicFramePr>
+              <a:graphicFrameLocks xmlns:a="http://schemas.openxmlformats.org/drawingml/2006/main" noChangeAspect="1"/>
+            </wp:cNvGraphicFramePr>
+            <a:graphic xmlns:a="http://schemas.openxmlformats.org/drawingml/2006/main">
+              <a:graphicData uri="http://schemas.openxmlformats.org/drawingml/2006/picture">
+                <pic:pic xmlns:pic="http://schemas.openxmlformats.org/drawingml/2006/picture">
+                  <pic:nvPicPr>
+                    <pic:cNvPr id="1415425614" name="Image 1" descr="Une image contenant texte, capture d’écran, logiciel, affichage&#10;&#10;Le contenu généré par l’IA peut être incorrect."/>
+                    <pic:cNvPicPr/>
+                  </pic:nvPicPr>
+                  <pic:blipFill>
+                    <a:blip r:embed="rId38"/>
+                    <a:stretch>
+                      <a:fillRect/>
+                    </a:stretch>
+                  </pic:blipFill>
+                  <pic:spPr>
+                    <a:xfrm>
+                      <a:off x="0" y="0"/>
+                      <a:ext cx="5759450" cy="5751830"/>
+                    </a:xfrm>
+                    <a:prstGeom prst="rect">
+                      <a:avLst/>
+                    </a:prstGeom>
+                  </pic:spPr>
+                </pic:pic>
+              </a:graphicData>
+            </a:graphic>
+          </wp:inline>
+        </w:drawing>
+      </w:r>
+    </w:p>
+    <w:p>
+      <w:pPr>
+        <w:pStyle w:val="Titre3"/>
+      </w:pPr>
+      <w:bookmarkStart w:id="62" w:name="_Toc213352335"/>
+      <w:r>
+        <w:lastRenderedPageBreak/>
+        <w:t>Requête 2</w:t>
+      </w:r>
+      <w:bookmarkEnd w:id="62"/>
+    </w:p>
+    <w:p>
+      <w:r>
+        <w:rPr>
+          <w:noProof/>
+        </w:rPr>
+        <w:drawing>
+          <wp:inline distT="0" distB="0" distL="0" distR="0" wp14:anchorId="33E914E0" wp14:editId="50249A95">
+            <wp:extent cx="5759450" cy="4414520"/>
+            <wp:effectExtent l="0" t="0" r="0" b="5080"/>
+            <wp:docPr id="1877199321" name="Image 1" descr="Une image contenant texte, capture d’écran, logiciel, Icône d’ordinateur&#10;&#10;Le contenu généré par l’IA peut être incorrect."/>
+            <wp:cNvGraphicFramePr>
+              <a:graphicFrameLocks xmlns:a="http://schemas.openxmlformats.org/drawingml/2006/main" noChangeAspect="1"/>
+            </wp:cNvGraphicFramePr>
+            <a:graphic xmlns:a="http://schemas.openxmlformats.org/drawingml/2006/main">
+              <a:graphicData uri="http://schemas.openxmlformats.org/drawingml/2006/picture">
+                <pic:pic xmlns:pic="http://schemas.openxmlformats.org/drawingml/2006/picture">
+                  <pic:nvPicPr>
+                    <pic:cNvPr id="1877199321" name="Image 1" descr="Une image contenant texte, capture d’écran, logiciel, Icône d’ordinateur&#10;&#10;Le contenu généré par l’IA peut être incorrect."/>
+                    <pic:cNvPicPr/>
+                  </pic:nvPicPr>
+                  <pic:blipFill>
+                    <a:blip r:embed="rId39"/>
+                    <a:stretch>
+                      <a:fillRect/>
+                    </a:stretch>
+                  </pic:blipFill>
+                  <pic:spPr>
+                    <a:xfrm>
+                      <a:off x="0" y="0"/>
+                      <a:ext cx="5759450" cy="4414520"/>
+                    </a:xfrm>
+                    <a:prstGeom prst="rect">
+                      <a:avLst/>
+                    </a:prstGeom>
+                  </pic:spPr>
+                </pic:pic>
+              </a:graphicData>
+            </a:graphic>
+          </wp:inline>
+        </w:drawing>
+      </w:r>
+    </w:p>
+    <w:p>
+      <w:pPr>
+        <w:pStyle w:val="Titre3"/>
+      </w:pPr>
+      <w:bookmarkStart w:id="63" w:name="_Toc213352336"/>
+      <w:r>
+        <w:lastRenderedPageBreak/>
+        <w:t>Requête 3</w:t>
+      </w:r>
+      <w:bookmarkEnd w:id="63"/>
+    </w:p>
+    <w:p>
+      <w:r>
+        <w:rPr>
+          <w:noProof/>
+        </w:rPr>
+        <w:drawing>
+          <wp:inline distT="0" distB="0" distL="0" distR="0" wp14:anchorId="04CB175E" wp14:editId="57143FF3">
+            <wp:extent cx="5759450" cy="7310120"/>
+            <wp:effectExtent l="0" t="0" r="0" b="5080"/>
+            <wp:docPr id="890799062" name="Image 1" descr="Une image contenant texte, capture d’écran, logiciel, Site web&#10;&#10;Le contenu généré par l’IA peut être incorrect."/>
+            <wp:cNvGraphicFramePr>
+              <a:graphicFrameLocks xmlns:a="http://schemas.openxmlformats.org/drawingml/2006/main" noChangeAspect="1"/>
+            </wp:cNvGraphicFramePr>
+            <a:graphic xmlns:a="http://schemas.openxmlformats.org/drawingml/2006/main">
+              <a:graphicData uri="http://schemas.openxmlformats.org/drawingml/2006/picture">
+                <pic:pic xmlns:pic="http://schemas.openxmlformats.org/drawingml/2006/picture">
+                  <pic:nvPicPr>
+                    <pic:cNvPr id="890799062" name="Image 1" descr="Une image contenant texte, capture d’écran, logiciel, Site web&#10;&#10;Le contenu généré par l’IA peut être incorrect."/>
+                    <pic:cNvPicPr/>
+                  </pic:nvPicPr>
+                  <pic:blipFill>
+                    <a:blip r:embed="rId40"/>
+                    <a:stretch>
+                      <a:fillRect/>
+                    </a:stretch>
+                  </pic:blipFill>
+                  <pic:spPr>
+                    <a:xfrm>
+                      <a:off x="0" y="0"/>
+                      <a:ext cx="5759450" cy="7310120"/>
+                    </a:xfrm>
+                    <a:prstGeom prst="rect">
+                      <a:avLst/>
+                    </a:prstGeom>
+                  </pic:spPr>
+                </pic:pic>
+              </a:graphicData>
+            </a:graphic>
+          </wp:inline>
+        </w:drawing>
+      </w:r>
+    </w:p>
+    <w:p>
+      <w:pPr>
+        <w:pStyle w:val="Titre3"/>
+      </w:pPr>
+      <w:bookmarkStart w:id="64" w:name="_Toc213352337"/>
+      <w:r>
+        <w:t>Requête</w:t>
+      </w:r>
+      <w:r>
+        <w:t xml:space="preserve"> 4</w:t>
+      </w:r>
+      <w:bookmarkEnd w:id="64"/>
+    </w:p>
+    <w:p/>
+    <w:p>
+      <w:r>
+        <w:rPr>
+          <w:noProof/>
+        </w:rPr>
+        <w:lastRenderedPageBreak/>
+        <w:drawing>
+          <wp:inline distT="0" distB="0" distL="0" distR="0" wp14:anchorId="3EAF66AB" wp14:editId="298F2078">
+            <wp:extent cx="5759450" cy="6442710"/>
+            <wp:effectExtent l="0" t="0" r="0" b="0"/>
+            <wp:docPr id="278223279" name="Image 1" descr="Une image contenant texte, capture d’écran, logiciel, Police&#10;&#10;Le contenu généré par l’IA peut être incorrect."/>
+            <wp:cNvGraphicFramePr>
+              <a:graphicFrameLocks xmlns:a="http://schemas.openxmlformats.org/drawingml/2006/main" noChangeAspect="1"/>
+            </wp:cNvGraphicFramePr>
+            <a:graphic xmlns:a="http://schemas.openxmlformats.org/drawingml/2006/main">
+              <a:graphicData uri="http://schemas.openxmlformats.org/drawingml/2006/picture">
+                <pic:pic xmlns:pic="http://schemas.openxmlformats.org/drawingml/2006/picture">
+                  <pic:nvPicPr>
+                    <pic:cNvPr id="278223279" name="Image 1" descr="Une image contenant texte, capture d’écran, logiciel, Police&#10;&#10;Le contenu généré par l’IA peut être incorrect."/>
+                    <pic:cNvPicPr/>
+                  </pic:nvPicPr>
+                  <pic:blipFill>
+                    <a:blip r:embed="rId41"/>
+                    <a:stretch>
+                      <a:fillRect/>
+                    </a:stretch>
+                  </pic:blipFill>
+                  <pic:spPr>
+                    <a:xfrm>
+                      <a:off x="0" y="0"/>
+                      <a:ext cx="5759450" cy="6442710"/>
+                    </a:xfrm>
+                    <a:prstGeom prst="rect">
+                      <a:avLst/>
+                    </a:prstGeom>
+                  </pic:spPr>
+                </pic:pic>
+              </a:graphicData>
+            </a:graphic>
+          </wp:inline>
+        </w:drawing>
+      </w:r>
+    </w:p>
+    <w:p>
+      <w:r>
+        <w:rPr>
+          <w:noProof/>
+        </w:rPr>
+        <w:lastRenderedPageBreak/>
+        <w:drawing>
+          <wp:inline distT="0" distB="0" distL="0" distR="0" wp14:anchorId="3EB2C31B" wp14:editId="65A666F4">
+            <wp:extent cx="5759450" cy="7139940"/>
+            <wp:effectExtent l="0" t="0" r="0" b="3810"/>
+            <wp:docPr id="74431228" name="Image 1" descr="Une image contenant texte, capture d’écran, logiciel, Site web&#10;&#10;Le contenu généré par l’IA peut être incorrect."/>
+            <wp:cNvGraphicFramePr>
+              <a:graphicFrameLocks xmlns:a="http://schemas.openxmlformats.org/drawingml/2006/main" noChangeAspect="1"/>
+            </wp:cNvGraphicFramePr>
+            <a:graphic xmlns:a="http://schemas.openxmlformats.org/drawingml/2006/main">
+              <a:graphicData uri="http://schemas.openxmlformats.org/drawingml/2006/picture">
+                <pic:pic xmlns:pic="http://schemas.openxmlformats.org/drawingml/2006/picture">
+                  <pic:nvPicPr>
+                    <pic:cNvPr id="74431228" name="Image 1" descr="Une image contenant texte, capture d’écran, logiciel, Site web&#10;&#10;Le contenu généré par l’IA peut être incorrect."/>
+                    <pic:cNvPicPr/>
+                  </pic:nvPicPr>
+                  <pic:blipFill>
+                    <a:blip r:embed="rId42"/>
+                    <a:stretch>
+                      <a:fillRect/>
+                    </a:stretch>
+                  </pic:blipFill>
+                  <pic:spPr>
+                    <a:xfrm>
+                      <a:off x="0" y="0"/>
+                      <a:ext cx="5759450" cy="7139940"/>
+                    </a:xfrm>
+                    <a:prstGeom prst="rect">
+                      <a:avLst/>
+                    </a:prstGeom>
+                  </pic:spPr>
+                </pic:pic>
+              </a:graphicData>
+            </a:graphic>
+          </wp:inline>
+        </w:drawing>
+      </w:r>
+    </w:p>
+    <w:p>
+      <w:pPr>
+        <w:pStyle w:val="Titre3"/>
+      </w:pPr>
+      <w:bookmarkStart w:id="65" w:name="_Toc213352338"/>
+      <w:r>
+        <w:lastRenderedPageBreak/>
+        <w:t>Requête</w:t>
+      </w:r>
+      <w:r>
+        <w:t xml:space="preserve"> 5</w:t>
+      </w:r>
+      <w:bookmarkEnd w:id="65"/>
+    </w:p>
+    <w:p>
+      <w:r>
+        <w:rPr>
+          <w:noProof/>
+        </w:rPr>
+        <w:drawing>
+          <wp:inline distT="0" distB="0" distL="0" distR="0" wp14:anchorId="60143E28" wp14:editId="6757F333">
+            <wp:extent cx="5759450" cy="4808220"/>
+            <wp:effectExtent l="0" t="0" r="0" b="0"/>
+            <wp:docPr id="105301931" name="Image 1" descr="Une image contenant texte, capture d’écran, Police, logiciel&#10;&#10;Le contenu généré par l’IA peut être incorrect."/>
+            <wp:cNvGraphicFramePr>
+              <a:graphicFrameLocks xmlns:a="http://schemas.openxmlformats.org/drawingml/2006/main" noChangeAspect="1"/>
+            </wp:cNvGraphicFramePr>
+            <a:graphic xmlns:a="http://schemas.openxmlformats.org/drawingml/2006/main">
+              <a:graphicData uri="http://schemas.openxmlformats.org/drawingml/2006/picture">
+                <pic:pic xmlns:pic="http://schemas.openxmlformats.org/drawingml/2006/picture">
+                  <pic:nvPicPr>
+                    <pic:cNvPr id="105301931" name="Image 1" descr="Une image contenant texte, capture d’écran, Police, logiciel&#10;&#10;Le contenu généré par l’IA peut être incorrect."/>
+                    <pic:cNvPicPr/>
+                  </pic:nvPicPr>
+                  <pic:blipFill>
+                    <a:blip r:embed="rId43"/>
+                    <a:stretch>
+                      <a:fillRect/>
+                    </a:stretch>
+                  </pic:blipFill>
+                  <pic:spPr>
+                    <a:xfrm>
+                      <a:off x="0" y="0"/>
+                      <a:ext cx="5759450" cy="4808220"/>
+                    </a:xfrm>
+                    <a:prstGeom prst="rect">
+                      <a:avLst/>
+                    </a:prstGeom>
+                  </pic:spPr>
+                </pic:pic>
+              </a:graphicData>
+            </a:graphic>
+          </wp:inline>
+        </w:drawing>
+      </w:r>
+    </w:p>
+    <w:p>
+      <w:r>
+        <w:rPr>
+          <w:noProof/>
+        </w:rPr>
+        <w:drawing>
+          <wp:inline distT="0" distB="0" distL="0" distR="0" wp14:anchorId="1A83777B" wp14:editId="00D41593">
+            <wp:extent cx="5759450" cy="3515995"/>
+            <wp:effectExtent l="0" t="0" r="0" b="8255"/>
+            <wp:docPr id="1991323553" name="Image 1" descr="Une image contenant texte, capture d’écran, logiciel, Police&#10;&#10;Le contenu généré par l’IA peut être incorrect."/>
+            <wp:cNvGraphicFramePr>
+              <a:graphicFrameLocks xmlns:a="http://schemas.openxmlformats.org/drawingml/2006/main" noChangeAspect="1"/>
+            </wp:cNvGraphicFramePr>
+            <a:graphic xmlns:a="http://schemas.openxmlformats.org/drawingml/2006/main">
+              <a:graphicData uri="http://schemas.openxmlformats.org/drawingml/2006/picture">
+                <pic:pic xmlns:pic="http://schemas.openxmlformats.org/drawingml/2006/picture">
+                  <pic:nvPicPr>
+                    <pic:cNvPr id="1991323553" name="Image 1" descr="Une image contenant texte, capture d’écran, logiciel, Police&#10;&#10;Le contenu généré par l’IA peut être incorrect."/>
+                    <pic:cNvPicPr/>
+                  </pic:nvPicPr>
+                  <pic:blipFill>
+                    <a:blip r:embed="rId44"/>
+                    <a:stretch>
+                      <a:fillRect/>
+                    </a:stretch>
+                  </pic:blipFill>
+                  <pic:spPr>
+                    <a:xfrm>
+                      <a:off x="0" y="0"/>
+                      <a:ext cx="5759450" cy="3515995"/>
+                    </a:xfrm>
+                    <a:prstGeom prst="rect">
+                      <a:avLst/>
+                    </a:prstGeom>
+                  </pic:spPr>
+                </pic:pic>
+              </a:graphicData>
+            </a:graphic>
+          </wp:inline>
+        </w:drawing>
+      </w:r>
+    </w:p>
+    <w:p>
+      <w:pPr>
+        <w:pStyle w:val="Titre3"/>
+      </w:pPr>
+      <w:bookmarkStart w:id="66" w:name="_Toc213352339"/>
+      <w:r>
+        <w:lastRenderedPageBreak/>
+        <w:t>Requête 6</w:t>
+      </w:r>
+      <w:bookmarkEnd w:id="66"/>
+    </w:p>
+    <w:p>
+      <w:r>
+        <w:rPr>
+          <w:noProof/>
+        </w:rPr>
+        <w:drawing>
+          <wp:inline distT="0" distB="0" distL="0" distR="0" wp14:anchorId="2E5CFCA1" wp14:editId="4DBB6967">
+            <wp:extent cx="5759450" cy="7800975"/>
+            <wp:effectExtent l="0" t="0" r="0" b="9525"/>
+            <wp:docPr id="208630065" name="Image 1" descr="Une image contenant texte, capture d’écran, logiciel, Logiciel multimédia&#10;&#10;Le contenu généré par l’IA peut être incorrect."/>
+            <wp:cNvGraphicFramePr>
+              <a:graphicFrameLocks xmlns:a="http://schemas.openxmlformats.org/drawingml/2006/main" noChangeAspect="1"/>
+            </wp:cNvGraphicFramePr>
+            <a:graphic xmlns:a="http://schemas.openxmlformats.org/drawingml/2006/main">
+              <a:graphicData uri="http://schemas.openxmlformats.org/drawingml/2006/picture">
+                <pic:pic xmlns:pic="http://schemas.openxmlformats.org/drawingml/2006/picture">
+                  <pic:nvPicPr>
+                    <pic:cNvPr id="208630065" name="Image 1" descr="Une image contenant texte, capture d’écran, logiciel, Logiciel multimédia&#10;&#10;Le contenu généré par l’IA peut être incorrect."/>
+                    <pic:cNvPicPr/>
+                  </pic:nvPicPr>
+                  <pic:blipFill>
+                    <a:blip r:embed="rId45"/>
+                    <a:stretch>
+                      <a:fillRect/>
+                    </a:stretch>
+                  </pic:blipFill>
+                  <pic:spPr>
+                    <a:xfrm>
+                      <a:off x="0" y="0"/>
+                      <a:ext cx="5759450" cy="7800975"/>
+                    </a:xfrm>
+                    <a:prstGeom prst="rect">
+                      <a:avLst/>
+                    </a:prstGeom>
+                  </pic:spPr>
+                </pic:pic>
+              </a:graphicData>
+            </a:graphic>
+          </wp:inline>
+        </w:drawing>
+      </w:r>
+    </w:p>
+    <w:p>
+      <w:pPr>
+        <w:pStyle w:val="Titre3"/>
+      </w:pPr>
+      <w:bookmarkStart w:id="67" w:name="_Toc213352340"/>
+      <w:r>
+        <w:lastRenderedPageBreak/>
+        <w:t>Requête 7</w:t>
+      </w:r>
+      <w:bookmarkEnd w:id="67"/>
+    </w:p>
+    <w:p>
+      <w:r>
+        <w:rPr>
+          <w:noProof/>
+        </w:rPr>
+        <w:drawing>
+          <wp:inline distT="0" distB="0" distL="0" distR="0" wp14:anchorId="067F946B" wp14:editId="6C88E308">
+            <wp:extent cx="4810796" cy="4305901"/>
+            <wp:effectExtent l="0" t="0" r="8890" b="0"/>
+            <wp:docPr id="870693360" name="Image 1" descr="Une image contenant texte, capture d’écran, Police&#10;&#10;Le contenu généré par l’IA peut être incorrect."/>
+            <wp:cNvGraphicFramePr>
+              <a:graphicFrameLocks xmlns:a="http://schemas.openxmlformats.org/drawingml/2006/main" noChangeAspect="1"/>
+            </wp:cNvGraphicFramePr>
+            <a:graphic xmlns:a="http://schemas.openxmlformats.org/drawingml/2006/main">
+              <a:graphicData uri="http://schemas.openxmlformats.org/drawingml/2006/picture">
+                <pic:pic xmlns:pic="http://schemas.openxmlformats.org/drawingml/2006/picture">
+                  <pic:nvPicPr>
+                    <pic:cNvPr id="870693360" name="Image 1" descr="Une image contenant texte, capture d’écran, Police&#10;&#10;Le contenu généré par l’IA peut être incorrect."/>
+                    <pic:cNvPicPr/>
+                  </pic:nvPicPr>
+                  <pic:blipFill>
+                    <a:blip r:embed="rId46"/>
+                    <a:stretch>
+                      <a:fillRect/>
+                    </a:stretch>
+                  </pic:blipFill>
+                  <pic:spPr>
+                    <a:xfrm>
+                      <a:off x="0" y="0"/>
+                      <a:ext cx="4810796" cy="4305901"/>
+                    </a:xfrm>
+                    <a:prstGeom prst="rect">
+                      <a:avLst/>
+                    </a:prstGeom>
+                  </pic:spPr>
+                </pic:pic>
+              </a:graphicData>
+            </a:graphic>
+          </wp:inline>
+        </w:drawing>
+      </w:r>
+    </w:p>
+    <w:p>
+      <w:r>
+        <w:rPr>
+          <w:noProof/>
+        </w:rPr>
+        <w:lastRenderedPageBreak/>
+        <w:drawing>
+          <wp:inline distT="0" distB="0" distL="0" distR="0" wp14:anchorId="14C3A374" wp14:editId="0F3916F0">
+            <wp:extent cx="5759450" cy="7108190"/>
+            <wp:effectExtent l="0" t="0" r="0" b="0"/>
+            <wp:docPr id="857235109" name="Image 1" descr="Une image contenant texte, capture d’écran, logiciel, Logiciel multimédia&#10;&#10;Le contenu généré par l’IA peut être incorrect."/>
+            <wp:cNvGraphicFramePr>
+              <a:graphicFrameLocks xmlns:a="http://schemas.openxmlformats.org/drawingml/2006/main" noChangeAspect="1"/>
+            </wp:cNvGraphicFramePr>
+            <a:graphic xmlns:a="http://schemas.openxmlformats.org/drawingml/2006/main">
+              <a:graphicData uri="http://schemas.openxmlformats.org/drawingml/2006/picture">
+                <pic:pic xmlns:pic="http://schemas.openxmlformats.org/drawingml/2006/picture">
+                  <pic:nvPicPr>
+                    <pic:cNvPr id="857235109" name="Image 1" descr="Une image contenant texte, capture d’écran, logiciel, Logiciel multimédia&#10;&#10;Le contenu généré par l’IA peut être incorrect."/>
+                    <pic:cNvPicPr/>
+                  </pic:nvPicPr>
+                  <pic:blipFill>
+                    <a:blip r:embed="rId47"/>
+                    <a:stretch>
+                      <a:fillRect/>
+                    </a:stretch>
+                  </pic:blipFill>
+                  <pic:spPr>
+                    <a:xfrm>
+                      <a:off x="0" y="0"/>
+                      <a:ext cx="5759450" cy="7108190"/>
+                    </a:xfrm>
+                    <a:prstGeom prst="rect">
+                      <a:avLst/>
+                    </a:prstGeom>
+                  </pic:spPr>
+                </pic:pic>
+              </a:graphicData>
+            </a:graphic>
+          </wp:inline>
+        </w:drawing>
+      </w:r>
+    </w:p>
+    <w:p>
+      <w:r>
+        <w:rPr>
+          <w:noProof/>
+        </w:rPr>
+        <w:lastRenderedPageBreak/>
+        <w:drawing>
+          <wp:inline distT="0" distB="0" distL="0" distR="0" wp14:anchorId="55B03658" wp14:editId="23F6247E">
+            <wp:extent cx="5759450" cy="1993265"/>
+            <wp:effectExtent l="0" t="0" r="0" b="6985"/>
+            <wp:docPr id="1464415330" name="Image 1" descr="Une image contenant texte, capture d’écran, logiciel, Logiciel multimédia&#10;&#10;Le contenu généré par l’IA peut être incorrect."/>
+            <wp:cNvGraphicFramePr>
+              <a:graphicFrameLocks xmlns:a="http://schemas.openxmlformats.org/drawingml/2006/main" noChangeAspect="1"/>
+            </wp:cNvGraphicFramePr>
+            <a:graphic xmlns:a="http://schemas.openxmlformats.org/drawingml/2006/main">
+              <a:graphicData uri="http://schemas.openxmlformats.org/drawingml/2006/picture">
+                <pic:pic xmlns:pic="http://schemas.openxmlformats.org/drawingml/2006/picture">
+                  <pic:nvPicPr>
+                    <pic:cNvPr id="1464415330" name="Image 1" descr="Une image contenant texte, capture d’écran, logiciel, Logiciel multimédia&#10;&#10;Le contenu généré par l’IA peut être incorrect."/>
+                    <pic:cNvPicPr/>
+                  </pic:nvPicPr>
+                  <pic:blipFill>
+                    <a:blip r:embed="rId48"/>
+                    <a:stretch>
+                      <a:fillRect/>
+                    </a:stretch>
+                  </pic:blipFill>
+                  <pic:spPr>
+                    <a:xfrm>
+                      <a:off x="0" y="0"/>
+                      <a:ext cx="5759450" cy="1993265"/>
+                    </a:xfrm>
+                    <a:prstGeom prst="rect">
+                      <a:avLst/>
+                    </a:prstGeom>
+                  </pic:spPr>
+                </pic:pic>
+              </a:graphicData>
+            </a:graphic>
+          </wp:inline>
+        </w:drawing>
+      </w:r>
+    </w:p>
+    <w:p>
+      <w:pPr>
+        <w:pStyle w:val="Titre3"/>
+      </w:pPr>
+      <w:bookmarkStart w:id="68" w:name="_Toc213352341"/>
+      <w:r>
+        <w:t>Débrief des requêtes</w:t>
+      </w:r>
+      <w:bookmarkEnd w:id="68"/>
+    </w:p>
+    <w:p>
+      <w:r>
+        <w:t>La simplicité d</w:t>
+      </w:r>
+      <w:r>
+        <w:t>es</w:t>
+      </w:r>
+      <w:r>
+        <w:t xml:space="preserve"> demandes faites à l’IA vienne du fait qu’elles ont été posées à un stade peu avancer du projet. Cela vient du fait que l’utilisation de l’IA étaient couplé à une lecture de la documentation fourni par l’ETML et des solutions d’exercices vu en classe. Cela a été fait dans le but de comprendre le plus efficacement possible et ne pas dépendre de l’IA, car je sais que ce sont des notions très importantes à apprendre en tant que développeur.</w:t>
       </w:r>
     </w:p>
     <w:sectPr>
-      <w:headerReference w:type="default" r:id="rId23"/>
-      <w:footerReference w:type="default" r:id="rId24"/>
+      <w:headerReference w:type="default" r:id="rId49"/>
+      <w:footerReference w:type="default" r:id="rId50"/>
       <w:pgSz w:w="11906" w:h="16838" w:code="9"/>
-      <w:pgMar w:top="1418" w:right="1418" w:bottom="1418" w:left="1418" w:header="709" w:footer="709" w:gutter="0"/>
+      <w:pgMar w:top="1276" w:right="1418" w:bottom="1134" w:left="1418" w:header="709" w:footer="480" w:gutter="0"/>
       <w:cols w:space="708"/>
       <w:titlePg/>
       <w:docGrid w:linePitch="360"/>
@@ -6381,7 +8507,7 @@
               <w:noProof/>
               <w:szCs w:val="16"/>
             </w:rPr>
-            <w:t>31.10.2025 12:05</w:t>
+            <w:t>06.11.2025 20:09</w:t>
           </w:r>
           <w:r>
             <w:rPr>
@@ -6516,7 +8642,7 @@
               <wp:inline distT="0" distB="0" distL="0" distR="0" wp14:anchorId="7C62B2D0" wp14:editId="7172CDBF">
                 <wp:extent cx="1046480" cy="315680"/>
                 <wp:effectExtent l="0" t="0" r="1270" b="8255"/>
-                <wp:docPr id="2" name="Image 2" descr="Logo_entete"/>
+                <wp:docPr id="1469110159" name="Image 1469110159" descr="Logo_entete"/>
                 <wp:cNvGraphicFramePr>
                   <a:graphicFrameLocks xmlns:a="http://schemas.openxmlformats.org/drawingml/2006/main" noChangeAspect="1"/>
                 </wp:cNvGraphicFramePr>
@@ -6593,7 +8719,7 @@
         <v:path o:extrusionok="f" gradientshapeok="t" o:connecttype="rect"/>
         <o:lock v:ext="edit" aspectratio="t"/>
       </v:shapetype>
-      <v:shape id="_x0000_i1097" type="#_x0000_t75" style="width:11.55pt;height:11.55pt" o:bullet="t">
+      <v:shape id="_x0000_i1033" type="#_x0000_t75" style="width:11.25pt;height:11.25pt" o:bullet="t">
         <v:imagedata r:id="rId1" o:title="BD10263_"/>
       </v:shape>
     </w:pict>
@@ -11246,6 +13372,11 @@
       <w:shd w:val="clear" w:color="auto" w:fill="E1DFDD"/>
     </w:rPr>
   </w:style>
+  <w:style w:type="character" w:customStyle="1" w:styleId="whitespace-pre-wrap">
+    <w:name w:val="whitespace-pre-wrap"/>
+    <w:basedOn w:val="Policepardfaut"/>
+    <w:rsid w:val="00F75B1B"/>
+  </w:style>
 </w:styles>
 </file>
 
@@ -11540,15 +13671,6 @@
 </file>
 
 <file path=customXml/item2.xml><?xml version="1.0" encoding="utf-8"?>
-<?mso-contentType ?>
-<FormTemplates xmlns="http://schemas.microsoft.com/sharepoint/v3/contenttype/forms">
-  <Display>DocumentLibraryForm</Display>
-  <Edit>DocumentLibraryForm</Edit>
-  <New>DocumentLibraryForm</New>
-</FormTemplates>
-</file>
-
-<file path=customXml/item3.xml><?xml version="1.0" encoding="utf-8"?>
 <ct:contentTypeSchema xmlns:ct="http://schemas.microsoft.com/office/2006/metadata/contentType" xmlns:ma="http://schemas.microsoft.com/office/2006/metadata/properties/metaAttributes" ct:_="" ma:_="" ma:contentTypeName="Document" ma:contentTypeID="0x0101005A5B8F5EAAC22C48A11F5D9A60E6F21D" ma:contentTypeVersion="16" ma:contentTypeDescription="Crée un document." ma:contentTypeScope="" ma:versionID="f2b963976306cc54294b7f4545a3c6c4">
   <xsd:schema xmlns:xsd="http://www.w3.org/2001/XMLSchema" xmlns:xs="http://www.w3.org/2001/XMLSchema" xmlns:p="http://schemas.microsoft.com/office/2006/metadata/properties" xmlns:ns2="a1b10758-7132-46a4-a2fe-7a2cf46f51f4" xmlns:ns3="f7d9f5a6-831d-4621-8c77-cbcaf993e406" targetNamespace="http://schemas.microsoft.com/office/2006/metadata/properties" ma:root="true" ma:fieldsID="e5e135fa2fc1295e1586ddcd9c1a8904" ns2:_="" ns3:_="">
     <xsd:import namespace="a1b10758-7132-46a4-a2fe-7a2cf46f51f4"/>
@@ -11791,7 +13913,7 @@
 </ct:contentTypeSchema>
 </file>
 
-<file path=customXml/item4.xml><?xml version="1.0" encoding="utf-8"?>
+<file path=customXml/item3.xml><?xml version="1.0" encoding="utf-8"?>
 <p:properties xmlns:p="http://schemas.microsoft.com/office/2006/metadata/properties" xmlns:xsi="http://www.w3.org/2001/XMLSchema-instance" xmlns:pc="http://schemas.microsoft.com/office/infopath/2007/PartnerControls">
   <documentManagement>
     <lcf76f155ced4ddcb4097134ff3c332f xmlns="a1b10758-7132-46a4-a2fe-7a2cf46f51f4">
@@ -11800,6 +13922,15 @@
     <TaxCatchAll xmlns="f7d9f5a6-831d-4621-8c77-cbcaf993e406" xsi:nil="true"/>
   </documentManagement>
 </p:properties>
+</file>
+
+<file path=customXml/item4.xml><?xml version="1.0" encoding="utf-8"?>
+<?mso-contentType ?>
+<FormTemplates xmlns="http://schemas.microsoft.com/sharepoint/v3/contenttype/forms">
+  <Display>DocumentLibraryForm</Display>
+  <Edit>DocumentLibraryForm</Edit>
+  <New>DocumentLibraryForm</New>
+</FormTemplates>
 </file>
 
 <file path=customXml/itemProps1.xml><?xml version="1.0" encoding="utf-8"?>
@@ -11811,14 +13942,6 @@
 </file>
 
 <file path=customXml/itemProps2.xml><?xml version="1.0" encoding="utf-8"?>
-<ds:datastoreItem xmlns:ds="http://schemas.openxmlformats.org/officeDocument/2006/customXml" ds:itemID="{6C3F7A66-EDE3-46FD-83EB-3C265E5D2669}">
-  <ds:schemaRefs>
-    <ds:schemaRef ds:uri="http://schemas.microsoft.com/sharepoint/v3/contenttype/forms"/>
-  </ds:schemaRefs>
-</ds:datastoreItem>
-</file>
-
-<file path=customXml/itemProps3.xml><?xml version="1.0" encoding="utf-8"?>
 <ds:datastoreItem xmlns:ds="http://schemas.openxmlformats.org/officeDocument/2006/customXml" ds:itemID="{41546E4A-837A-4BEF-A4B8-FFD4EAB4E855}">
   <ds:schemaRefs>
     <ds:schemaRef ds:uri="http://schemas.microsoft.com/office/2006/metadata/contentType"/>
@@ -11837,7 +13960,7 @@
 </ds:datastoreItem>
 </file>
 
-<file path=customXml/itemProps4.xml><?xml version="1.0" encoding="utf-8"?>
+<file path=customXml/itemProps3.xml><?xml version="1.0" encoding="utf-8"?>
 <ds:datastoreItem xmlns:ds="http://schemas.openxmlformats.org/officeDocument/2006/customXml" ds:itemID="{2319CDB8-A2CD-412D-8359-13E6B4DF1FF4}">
   <ds:schemaRefs>
     <ds:schemaRef ds:uri="http://schemas.microsoft.com/office/2006/metadata/properties"/>
@@ -11846,4 +13969,12 @@
     <ds:schemaRef ds:uri="f7d9f5a6-831d-4621-8c77-cbcaf993e406"/>
   </ds:schemaRefs>
 </ds:datastoreItem>
+</file>
+
+<file path=customXml/itemProps4.xml><?xml version="1.0" encoding="utf-8"?>
+<ds:datastoreItem xmlns:ds="http://schemas.openxmlformats.org/officeDocument/2006/customXml" ds:itemID="{6C3F7A66-EDE3-46FD-83EB-3C265E5D2669}">
+  <ds:schemaRefs>
+    <ds:schemaRef ds:uri="http://schemas.microsoft.com/sharepoint/v3/contenttype/forms"/>
+  </ds:schemaRefs>
+</ds:datastoreItem>
 </file>
</xml_diff>